<commit_message>
Agrego momento II y carpetas donde estaran los Sprites
</commit_message>
<xml_diff>
--- a/Momento I/Momento I.docx
+++ b/Momento I/Momento I.docx
@@ -35,7 +35,85 @@
           <w:szCs w:val="24"/>
           <w:lang w:val="en-US"/>
         </w:rPr>
-        <w:t xml:space="preserve">Proyecto final - Momento I</w:t>
+        <w:t xml:space="preserve">Proyecto final:</w:t>
+      </w:r>
+      <w:r>
+        <w:rPr>
+          <w:rFonts w:ascii="Times New Roman" w:hAnsi="Times New Roman" w:eastAsia="Times New Roman" w:cs="Times New Roman"/>
+          <w:b w:val="0"/>
+          <w:bCs w:val="0"/>
+          <w:color w:val="000000"/>
+          <w:sz w:val="24"/>
+          <w:szCs w:val="24"/>
+          <w:lang w:val="en-US"/>
+        </w:rPr>
+        <w:t xml:space="preserve"> El capitan america en la guerra de los mil dias.</w:t>
+      </w:r>
+      <w:r>
+        <w:rPr>
+          <w:rFonts w:ascii="Times New Roman" w:hAnsi="Times New Roman" w:eastAsia="Times New Roman" w:cs="Times New Roman"/>
+          <w:b w:val="0"/>
+          <w:bCs w:val="0"/>
+          <w:color w:val="000000"/>
+          <w:sz w:val="24"/>
+          <w:szCs w:val="24"/>
+          <w:lang w:val="en-US"/>
+        </w:rPr>
+        <w:t xml:space="preserve"> - Momento I</w:t>
+      </w:r>
+      <w:r>
+        <w:rPr>
+          <w:rFonts w:ascii="Times New Roman" w:hAnsi="Times New Roman" w:cs="Times New Roman"/>
+          <w:b w:val="0"/>
+          <w:bCs w:val="0"/>
+          <w:sz w:val="24"/>
+          <w:szCs w:val="24"/>
+          <w:highlight w:val="none"/>
+        </w:rPr>
+      </w:r>
+      <w:r>
+        <w:rPr>
+          <w:rFonts w:ascii="Times New Roman" w:hAnsi="Times New Roman" w:cs="Times New Roman"/>
+          <w:b w:val="0"/>
+          <w:bCs w:val="0"/>
+          <w:sz w:val="24"/>
+          <w:szCs w:val="24"/>
+          <w:highlight w:val="none"/>
+        </w:rPr>
+      </w:r>
+    </w:p>
+    <w:p>
+      <w:pPr>
+        <w:spacing w:after="0" w:before="0" w:line="331" w:lineRule="auto"/>
+        <w:ind w:right="0" w:firstLine="0" w:left="0"/>
+        <w:jc w:val="center"/>
+        <w:rPr>
+          <w:rFonts w:ascii="Times New Roman" w:hAnsi="Times New Roman" w:cs="Times New Roman"/>
+          <w:b w:val="0"/>
+          <w:bCs w:val="0"/>
+          <w:sz w:val="24"/>
+          <w:szCs w:val="24"/>
+          <w:highlight w:val="none"/>
+        </w:rPr>
+      </w:pPr>
+      <w:r>
+        <w:rPr>
+          <w:rFonts w:ascii="Times New Roman" w:hAnsi="Times New Roman" w:eastAsia="Times New Roman" w:cs="Times New Roman"/>
+          <w:b/>
+          <w:bCs/>
+          <w:sz w:val="24"/>
+          <w:szCs w:val="24"/>
+        </w:rPr>
+      </w:r>
+      <w:r>
+        <w:rPr>
+          <w:rFonts w:ascii="Times New Roman" w:hAnsi="Times New Roman" w:cs="Times New Roman"/>
+          <w:b w:val="0"/>
+          <w:bCs w:val="0"/>
+          <w:sz w:val="24"/>
+          <w:szCs w:val="24"/>
+          <w:highlight w:val="none"/>
+        </w:rPr>
       </w:r>
       <w:r>
         <w:rPr>
@@ -1551,7 +1629,7 @@
     </w:p>
     <w:p>
       <w:pPr>
-        <w:pStyle w:val="141"/>
+        <w:pStyle w:val="829"/>
         <w:spacing/>
         <w:ind w:right="0" w:firstLine="0" w:left="0"/>
         <w:rPr>
@@ -1576,6 +1654,12 @@
           <w:szCs w:val="24"/>
         </w:rPr>
       </w:r>
+      <w:r>
+        <w:rPr>
+          <w:sz w:val="24"/>
+          <w:szCs w:val="24"/>
+        </w:rPr>
+      </w:r>
     </w:p>
     <w:p>
       <w:pPr>
@@ -1591,7 +1675,6 @@
           <w:sz w:val="28"/>
         </w:rPr>
       </w:r>
-      <w:r/>
       <w:r/>
     </w:p>
     <w:p>
@@ -1666,7 +1749,6 @@
       </w:pPr>
       <w:r/>
       <w:r/>
-      <w:r/>
     </w:p>
     <w:p>
       <w:pPr>
@@ -1674,7 +1756,6 @@
         <w:ind/>
         <w:rPr/>
       </w:pPr>
-      <w:r/>
       <w:r/>
       <w:r/>
     </w:p>
@@ -1686,7 +1767,6 @@
       </w:pPr>
       <w:r/>
       <w:r/>
-      <w:r/>
     </w:p>
     <w:p>
       <w:pPr>
@@ -1694,7 +1774,6 @@
         <w:ind/>
         <w:rPr/>
       </w:pPr>
-      <w:r/>
       <w:r/>
       <w:r/>
     </w:p>
@@ -1706,7 +1785,6 @@
       </w:pPr>
       <w:r/>
       <w:r/>
-      <w:r/>
     </w:p>
     <w:p>
       <w:pPr>
@@ -1714,7 +1792,6 @@
         <w:ind/>
         <w:rPr/>
       </w:pPr>
-      <w:r/>
       <w:r/>
       <w:r/>
     </w:p>
@@ -1726,7 +1803,6 @@
       </w:pPr>
       <w:r/>
       <w:r/>
-      <w:r/>
     </w:p>
     <w:p>
       <w:pPr>
@@ -1734,7 +1810,6 @@
         <w:ind/>
         <w:rPr/>
       </w:pPr>
-      <w:r/>
       <w:r/>
       <w:r/>
     </w:p>
@@ -1746,7 +1821,6 @@
       </w:pPr>
       <w:r/>
       <w:r/>
-      <w:r/>
     </w:p>
     <w:p>
       <w:pPr>
@@ -1754,7 +1828,6 @@
         <w:ind/>
         <w:rPr/>
       </w:pPr>
-      <w:r/>
       <w:r/>
       <w:r/>
     </w:p>
@@ -1766,7 +1839,6 @@
       </w:pPr>
       <w:r/>
       <w:r/>
-      <w:r/>
     </w:p>
     <w:p>
       <w:pPr>
@@ -1774,7 +1846,6 @@
         <w:ind/>
         <w:rPr/>
       </w:pPr>
-      <w:r/>
       <w:r/>
       <w:r/>
     </w:p>
@@ -1786,7 +1857,6 @@
       </w:pPr>
       <w:r/>
       <w:r/>
-      <w:r/>
     </w:p>
     <w:p>
       <w:pPr>
@@ -1794,7 +1864,6 @@
         <w:ind/>
         <w:rPr/>
       </w:pPr>
-      <w:r/>
       <w:r/>
       <w:r/>
     </w:p>
@@ -1806,7 +1875,6 @@
       </w:pPr>
       <w:r/>
       <w:r/>
-      <w:r/>
     </w:p>
     <w:p>
       <w:pPr>
@@ -1814,7 +1882,6 @@
         <w:ind/>
         <w:rPr/>
       </w:pPr>
-      <w:r/>
       <w:r/>
       <w:r/>
     </w:p>
@@ -1826,7 +1893,6 @@
       </w:pPr>
       <w:r/>
       <w:r/>
-      <w:r/>
     </w:p>
     <w:p>
       <w:pPr>
@@ -1834,7 +1900,6 @@
         <w:ind/>
         <w:rPr/>
       </w:pPr>
-      <w:r/>
       <w:r/>
       <w:r/>
     </w:p>
@@ -1846,7 +1911,6 @@
       </w:pPr>
       <w:r/>
       <w:r/>
-      <w:r/>
     </w:p>
     <w:p>
       <w:pPr>
@@ -1854,7 +1918,6 @@
         <w:ind/>
         <w:rPr/>
       </w:pPr>
-      <w:r/>
       <w:r/>
       <w:r/>
     </w:p>
@@ -1866,7 +1929,6 @@
       </w:pPr>
       <w:r/>
       <w:r/>
-      <w:r/>
     </w:p>
     <w:p>
       <w:pPr>
@@ -1874,7 +1936,6 @@
         <w:ind/>
         <w:rPr/>
       </w:pPr>
-      <w:r/>
       <w:r/>
       <w:r/>
     </w:p>
@@ -1886,7 +1947,6 @@
       </w:pPr>
       <w:r/>
       <w:r/>
-      <w:r/>
     </w:p>
     <w:p>
       <w:pPr>
@@ -1894,7 +1954,6 @@
         <w:ind/>
         <w:rPr/>
       </w:pPr>
-      <w:r/>
       <w:r/>
       <w:r/>
     </w:p>
@@ -1906,11 +1965,10 @@
       </w:pPr>
       <w:r/>
       <w:r/>
-      <w:r/>
     </w:p>
     <w:p>
       <w:pPr>
-        <w:pStyle w:val="141"/>
+        <w:pStyle w:val="829"/>
         <w:spacing/>
         <w:ind w:right="0" w:firstLine="0" w:left="0"/>
         <w:rPr>
@@ -1935,6 +1993,12 @@
           <w:szCs w:val="24"/>
         </w:rPr>
       </w:r>
+      <w:r>
+        <w:rPr>
+          <w:sz w:val="24"/>
+          <w:szCs w:val="24"/>
+        </w:rPr>
+      </w:r>
     </w:p>
     <w:p>
       <w:pPr>
@@ -1950,7 +2014,6 @@
           <w:sz w:val="28"/>
         </w:rPr>
       </w:r>
-      <w:r/>
       <w:r/>
     </w:p>
     <w:p>
@@ -1994,9 +2057,6 @@
       </w:pPr>
       <w:r/>
       <w:r/>
-      <w:r/>
-      <w:r/>
-      <w:r/>
     </w:p>
     <w:sectPr>
       <w:footnotePr/>
@@ -2019,7 +2079,6 @@
         <w:ind/>
         <w:rPr/>
       </w:pPr>
-      <w:r/>
       <w:r>
         <w:separator/>
       </w:r>
@@ -2033,7 +2092,6 @@
         <w:ind/>
         <w:rPr/>
       </w:pPr>
-      <w:r/>
       <w:r>
         <w:continuationSeparator/>
       </w:r>
@@ -2052,7 +2110,6 @@
         <w:ind/>
         <w:rPr/>
       </w:pPr>
-      <w:r/>
       <w:r>
         <w:separator/>
       </w:r>
@@ -2066,7 +2123,6 @@
         <w:ind/>
         <w:rPr/>
       </w:pPr>
-      <w:r/>
       <w:r>
         <w:continuationSeparator/>
       </w:r>
@@ -2234,9 +2290,9 @@
     <w:lsdException w:name="Bibliography" w:uiPriority="37"/>
     <w:lsdException w:name="TOC Heading" w:uiPriority="39" w:qFormat="1"/>
   </w:latentStyles>
-  <w:style w:type="table" w:styleId="12">
+  <w:style w:type="table" w:styleId="701">
     <w:name w:val="Table Grid"/>
-    <w:basedOn w:val="665"/>
+    <w:basedOn w:val="887"/>
     <w:uiPriority w:val="59"/>
     <w:pPr>
       <w:pBdr/>
@@ -2433,9 +2489,9 @@
       </w:tcPr>
     </w:tblStylePr>
   </w:style>
-  <w:style w:type="table" w:styleId="13">
+  <w:style w:type="table" w:styleId="702">
     <w:name w:val="Table Grid Light"/>
-    <w:basedOn w:val="665"/>
+    <w:basedOn w:val="887"/>
     <w:uiPriority w:val="59"/>
     <w:pPr>
       <w:pBdr/>
@@ -2632,9 +2688,9 @@
       </w:tcPr>
     </w:tblStylePr>
   </w:style>
-  <w:style w:type="table" w:styleId="14">
+  <w:style w:type="table" w:styleId="703">
     <w:name w:val="Plain Table 1"/>
-    <w:basedOn w:val="665"/>
+    <w:basedOn w:val="887"/>
     <w:uiPriority w:val="59"/>
     <w:pPr>
       <w:pBdr/>
@@ -2857,9 +2913,9 @@
       </w:tcPr>
     </w:tblStylePr>
   </w:style>
-  <w:style w:type="table" w:styleId="15">
+  <w:style w:type="table" w:styleId="704">
     <w:name w:val="Plain Table 2"/>
-    <w:basedOn w:val="665"/>
+    <w:basedOn w:val="887"/>
     <w:uiPriority w:val="59"/>
     <w:pPr>
       <w:pBdr/>
@@ -3090,9 +3146,9 @@
       </w:tcPr>
     </w:tblStylePr>
   </w:style>
-  <w:style w:type="table" w:styleId="16">
+  <w:style w:type="table" w:styleId="705">
     <w:name w:val="Plain Table 3"/>
-    <w:basedOn w:val="665"/>
+    <w:basedOn w:val="887"/>
     <w:uiPriority w:val="99"/>
     <w:pPr>
       <w:pBdr/>
@@ -3320,9 +3376,9 @@
       </w:tcPr>
     </w:tblStylePr>
   </w:style>
-  <w:style w:type="table" w:styleId="17">
+  <w:style w:type="table" w:styleId="706">
     <w:name w:val="Plain Table 4"/>
-    <w:basedOn w:val="665"/>
+    <w:basedOn w:val="887"/>
     <w:uiPriority w:val="99"/>
     <w:pPr>
       <w:pBdr/>
@@ -3536,9 +3592,9 @@
       </w:tcPr>
     </w:tblStylePr>
   </w:style>
-  <w:style w:type="table" w:styleId="18">
+  <w:style w:type="table" w:styleId="707">
     <w:name w:val="Plain Table 5"/>
-    <w:basedOn w:val="665"/>
+    <w:basedOn w:val="887"/>
     <w:uiPriority w:val="99"/>
     <w:pPr>
       <w:pBdr/>
@@ -3769,9 +3825,9 @@
       </w:tcPr>
     </w:tblStylePr>
   </w:style>
-  <w:style w:type="table" w:styleId="19">
+  <w:style w:type="table" w:styleId="708">
     <w:name w:val="Grid Table 1 Light"/>
-    <w:basedOn w:val="665"/>
+    <w:basedOn w:val="887"/>
     <w:uiPriority w:val="99"/>
     <w:pPr>
       <w:pBdr/>
@@ -3992,9 +4048,9 @@
       </w:tcPr>
     </w:tblStylePr>
   </w:style>
-  <w:style w:type="table" w:styleId="20">
+  <w:style w:type="table" w:styleId="709">
     <w:name w:val="Grid Table 1 Light - Accent 1"/>
-    <w:basedOn w:val="665"/>
+    <w:basedOn w:val="887"/>
     <w:uiPriority w:val="99"/>
     <w:pPr>
       <w:pBdr/>
@@ -4215,9 +4271,9 @@
       </w:tcPr>
     </w:tblStylePr>
   </w:style>
-  <w:style w:type="table" w:styleId="21">
+  <w:style w:type="table" w:styleId="710">
     <w:name w:val="Grid Table 1 Light - Accent 2"/>
-    <w:basedOn w:val="665"/>
+    <w:basedOn w:val="887"/>
     <w:uiPriority w:val="99"/>
     <w:pPr>
       <w:pBdr/>
@@ -4438,9 +4494,9 @@
       </w:tcPr>
     </w:tblStylePr>
   </w:style>
-  <w:style w:type="table" w:styleId="22">
+  <w:style w:type="table" w:styleId="711">
     <w:name w:val="Grid Table 1 Light - Accent 3"/>
-    <w:basedOn w:val="665"/>
+    <w:basedOn w:val="887"/>
     <w:uiPriority w:val="99"/>
     <w:pPr>
       <w:pBdr/>
@@ -4661,9 +4717,9 @@
       </w:tcPr>
     </w:tblStylePr>
   </w:style>
-  <w:style w:type="table" w:styleId="23">
+  <w:style w:type="table" w:styleId="712">
     <w:name w:val="Grid Table 1 Light - Accent 4"/>
-    <w:basedOn w:val="665"/>
+    <w:basedOn w:val="887"/>
     <w:uiPriority w:val="99"/>
     <w:pPr>
       <w:pBdr/>
@@ -4884,9 +4940,9 @@
       </w:tcPr>
     </w:tblStylePr>
   </w:style>
-  <w:style w:type="table" w:styleId="24">
+  <w:style w:type="table" w:styleId="713">
     <w:name w:val="Grid Table 1 Light - Accent 5"/>
-    <w:basedOn w:val="665"/>
+    <w:basedOn w:val="887"/>
     <w:uiPriority w:val="99"/>
     <w:pPr>
       <w:pBdr/>
@@ -5107,9 +5163,9 @@
       </w:tcPr>
     </w:tblStylePr>
   </w:style>
-  <w:style w:type="table" w:styleId="25">
+  <w:style w:type="table" w:styleId="714">
     <w:name w:val="Grid Table 1 Light - Accent 6"/>
-    <w:basedOn w:val="665"/>
+    <w:basedOn w:val="887"/>
     <w:uiPriority w:val="99"/>
     <w:pPr>
       <w:pBdr/>
@@ -5330,9 +5386,9 @@
       </w:tcPr>
     </w:tblStylePr>
   </w:style>
-  <w:style w:type="table" w:styleId="26">
+  <w:style w:type="table" w:styleId="715">
     <w:name w:val="Grid Table 2"/>
-    <w:basedOn w:val="665"/>
+    <w:basedOn w:val="887"/>
     <w:uiPriority w:val="99"/>
     <w:pPr>
       <w:pBdr/>
@@ -5562,9 +5618,9 @@
       </w:tcPr>
     </w:tblStylePr>
   </w:style>
-  <w:style w:type="table" w:styleId="27">
+  <w:style w:type="table" w:styleId="716">
     <w:name w:val="Grid Table 2 - Accent 1"/>
-    <w:basedOn w:val="665"/>
+    <w:basedOn w:val="887"/>
     <w:uiPriority w:val="99"/>
     <w:pPr>
       <w:pBdr/>
@@ -5794,9 +5850,9 @@
       </w:tcPr>
     </w:tblStylePr>
   </w:style>
-  <w:style w:type="table" w:styleId="28">
+  <w:style w:type="table" w:styleId="717">
     <w:name w:val="Grid Table 2 - Accent 2"/>
-    <w:basedOn w:val="665"/>
+    <w:basedOn w:val="887"/>
     <w:uiPriority w:val="99"/>
     <w:pPr>
       <w:pBdr/>
@@ -6026,9 +6082,9 @@
       </w:tcPr>
     </w:tblStylePr>
   </w:style>
-  <w:style w:type="table" w:styleId="29">
+  <w:style w:type="table" w:styleId="718">
     <w:name w:val="Grid Table 2 - Accent 3"/>
-    <w:basedOn w:val="665"/>
+    <w:basedOn w:val="887"/>
     <w:uiPriority w:val="99"/>
     <w:pPr>
       <w:pBdr/>
@@ -6258,9 +6314,9 @@
       </w:tcPr>
     </w:tblStylePr>
   </w:style>
-  <w:style w:type="table" w:styleId="30">
+  <w:style w:type="table" w:styleId="719">
     <w:name w:val="Grid Table 2 - Accent 4"/>
-    <w:basedOn w:val="665"/>
+    <w:basedOn w:val="887"/>
     <w:uiPriority w:val="99"/>
     <w:pPr>
       <w:pBdr/>
@@ -6490,9 +6546,9 @@
       </w:tcPr>
     </w:tblStylePr>
   </w:style>
-  <w:style w:type="table" w:styleId="31">
+  <w:style w:type="table" w:styleId="720">
     <w:name w:val="Grid Table 2 - Accent 5"/>
-    <w:basedOn w:val="665"/>
+    <w:basedOn w:val="887"/>
     <w:uiPriority w:val="99"/>
     <w:pPr>
       <w:pBdr/>
@@ -6722,9 +6778,9 @@
       </w:tcPr>
     </w:tblStylePr>
   </w:style>
-  <w:style w:type="table" w:styleId="32">
+  <w:style w:type="table" w:styleId="721">
     <w:name w:val="Grid Table 2 - Accent 6"/>
-    <w:basedOn w:val="665"/>
+    <w:basedOn w:val="887"/>
     <w:uiPriority w:val="99"/>
     <w:pPr>
       <w:pBdr/>
@@ -6954,9 +7010,9 @@
       </w:tcPr>
     </w:tblStylePr>
   </w:style>
-  <w:style w:type="table" w:styleId="33">
+  <w:style w:type="table" w:styleId="722">
     <w:name w:val="Grid Table 3"/>
-    <w:basedOn w:val="665"/>
+    <w:basedOn w:val="887"/>
     <w:uiPriority w:val="99"/>
     <w:pPr>
       <w:pBdr/>
@@ -7055,29 +7111,6 @@
         <w:tblBorders/>
       </w:tblPr>
       <w:tcPr>
-        <w:shd w:color="ffffff"/>
-        <w:tcBorders>
-          <w:top w:val="none" w:color="000000" w:sz="4" w:space="0"/>
-          <w:left w:val="none" w:color="000000" w:sz="4" w:space="0"/>
-          <w:bottom w:val="none" w:color="000000" w:sz="4" w:space="0"/>
-          <w:right w:val="none" w:color="000000" w:sz="4" w:space="0"/>
-        </w:tcBorders>
-      </w:tcPr>
-    </w:tblStylePr>
-    <w:tblStylePr w:type="firstRow">
-      <w:rPr>
-        <w:b/>
-        <w:color w:val="404040"/>
-      </w:rPr>
-      <w:pPr>
-        <w:pBdr/>
-        <w:spacing/>
-        <w:ind/>
-      </w:pPr>
-      <w:tblPr>
-        <w:tblBorders/>
-      </w:tblPr>
-      <w:tcPr>
         <w:shd w:val="clear" w:color="ffffff"/>
         <w:tcBorders>
           <w:top w:val="none" w:color="000000" w:sz="4" w:space="0"/>
@@ -7087,30 +7120,7 @@
         </w:tcBorders>
       </w:tcPr>
     </w:tblStylePr>
-    <w:tblStylePr w:type="lastCol">
-      <w:rPr>
-        <w:i/>
-        <w:color w:val="404040"/>
-      </w:rPr>
-      <w:pPr>
-        <w:pBdr/>
-        <w:spacing/>
-        <w:ind/>
-      </w:pPr>
-      <w:tblPr>
-        <w:tblBorders/>
-      </w:tblPr>
-      <w:tcPr>
-        <w:shd w:color="ffffff"/>
-        <w:tcBorders>
-          <w:top w:val="none" w:color="000000" w:sz="4" w:space="0"/>
-          <w:left w:val="none" w:color="000000" w:sz="4" w:space="0"/>
-          <w:bottom w:val="none" w:color="000000" w:sz="4" w:space="0"/>
-          <w:right w:val="none" w:color="000000" w:sz="4" w:space="0"/>
-        </w:tcBorders>
-      </w:tcPr>
-    </w:tblStylePr>
-    <w:tblStylePr w:type="lastRow">
+    <w:tblStylePr w:type="firstRow">
       <w:rPr>
         <w:b/>
         <w:color w:val="404040"/>
@@ -7133,6 +7143,52 @@
         </w:tcBorders>
       </w:tcPr>
     </w:tblStylePr>
+    <w:tblStylePr w:type="lastCol">
+      <w:rPr>
+        <w:i/>
+        <w:color w:val="404040"/>
+      </w:rPr>
+      <w:pPr>
+        <w:pBdr/>
+        <w:spacing/>
+        <w:ind/>
+      </w:pPr>
+      <w:tblPr>
+        <w:tblBorders/>
+      </w:tblPr>
+      <w:tcPr>
+        <w:shd w:val="clear" w:color="ffffff"/>
+        <w:tcBorders>
+          <w:top w:val="none" w:color="000000" w:sz="4" w:space="0"/>
+          <w:left w:val="none" w:color="000000" w:sz="4" w:space="0"/>
+          <w:bottom w:val="none" w:color="000000" w:sz="4" w:space="0"/>
+          <w:right w:val="none" w:color="000000" w:sz="4" w:space="0"/>
+        </w:tcBorders>
+      </w:tcPr>
+    </w:tblStylePr>
+    <w:tblStylePr w:type="lastRow">
+      <w:rPr>
+        <w:b/>
+        <w:color w:val="404040"/>
+      </w:rPr>
+      <w:pPr>
+        <w:pBdr/>
+        <w:spacing/>
+        <w:ind/>
+      </w:pPr>
+      <w:tblPr>
+        <w:tblBorders/>
+      </w:tblPr>
+      <w:tcPr>
+        <w:shd w:val="clear" w:color="ffffff"/>
+        <w:tcBorders>
+          <w:top w:val="none" w:color="000000" w:sz="4" w:space="0"/>
+          <w:left w:val="none" w:color="000000" w:sz="4" w:space="0"/>
+          <w:bottom w:val="none" w:color="000000" w:sz="4" w:space="0"/>
+          <w:right w:val="none" w:color="000000" w:sz="4" w:space="0"/>
+        </w:tcBorders>
+      </w:tcPr>
+    </w:tblStylePr>
     <w:tblStylePr w:type="nwCell">
       <w:pPr>
         <w:pBdr/>
@@ -7199,9 +7255,9 @@
       </w:tcPr>
     </w:tblStylePr>
   </w:style>
-  <w:style w:type="table" w:styleId="34">
+  <w:style w:type="table" w:styleId="723">
     <w:name w:val="Grid Table 3 - Accent 1"/>
-    <w:basedOn w:val="665"/>
+    <w:basedOn w:val="887"/>
     <w:uiPriority w:val="99"/>
     <w:pPr>
       <w:pBdr/>
@@ -7300,29 +7356,6 @@
         <w:tblBorders/>
       </w:tblPr>
       <w:tcPr>
-        <w:shd w:color="ffffff"/>
-        <w:tcBorders>
-          <w:top w:val="none" w:color="000000" w:sz="4" w:space="0"/>
-          <w:left w:val="none" w:color="000000" w:sz="4" w:space="0"/>
-          <w:bottom w:val="none" w:color="000000" w:sz="4" w:space="0"/>
-          <w:right w:val="none" w:color="000000" w:sz="4" w:space="0"/>
-        </w:tcBorders>
-      </w:tcPr>
-    </w:tblStylePr>
-    <w:tblStylePr w:type="firstRow">
-      <w:rPr>
-        <w:b/>
-        <w:color w:val="404040"/>
-      </w:rPr>
-      <w:pPr>
-        <w:pBdr/>
-        <w:spacing/>
-        <w:ind/>
-      </w:pPr>
-      <w:tblPr>
-        <w:tblBorders/>
-      </w:tblPr>
-      <w:tcPr>
         <w:shd w:val="clear" w:color="ffffff"/>
         <w:tcBorders>
           <w:top w:val="none" w:color="000000" w:sz="4" w:space="0"/>
@@ -7332,30 +7365,7 @@
         </w:tcBorders>
       </w:tcPr>
     </w:tblStylePr>
-    <w:tblStylePr w:type="lastCol">
-      <w:rPr>
-        <w:i/>
-        <w:color w:val="404040"/>
-      </w:rPr>
-      <w:pPr>
-        <w:pBdr/>
-        <w:spacing/>
-        <w:ind/>
-      </w:pPr>
-      <w:tblPr>
-        <w:tblBorders/>
-      </w:tblPr>
-      <w:tcPr>
-        <w:shd w:color="ffffff"/>
-        <w:tcBorders>
-          <w:top w:val="none" w:color="000000" w:sz="4" w:space="0"/>
-          <w:left w:val="none" w:color="000000" w:sz="4" w:space="0"/>
-          <w:bottom w:val="none" w:color="000000" w:sz="4" w:space="0"/>
-          <w:right w:val="none" w:color="000000" w:sz="4" w:space="0"/>
-        </w:tcBorders>
-      </w:tcPr>
-    </w:tblStylePr>
-    <w:tblStylePr w:type="lastRow">
+    <w:tblStylePr w:type="firstRow">
       <w:rPr>
         <w:b/>
         <w:color w:val="404040"/>
@@ -7378,6 +7388,52 @@
         </w:tcBorders>
       </w:tcPr>
     </w:tblStylePr>
+    <w:tblStylePr w:type="lastCol">
+      <w:rPr>
+        <w:i/>
+        <w:color w:val="404040"/>
+      </w:rPr>
+      <w:pPr>
+        <w:pBdr/>
+        <w:spacing/>
+        <w:ind/>
+      </w:pPr>
+      <w:tblPr>
+        <w:tblBorders/>
+      </w:tblPr>
+      <w:tcPr>
+        <w:shd w:val="clear" w:color="ffffff"/>
+        <w:tcBorders>
+          <w:top w:val="none" w:color="000000" w:sz="4" w:space="0"/>
+          <w:left w:val="none" w:color="000000" w:sz="4" w:space="0"/>
+          <w:bottom w:val="none" w:color="000000" w:sz="4" w:space="0"/>
+          <w:right w:val="none" w:color="000000" w:sz="4" w:space="0"/>
+        </w:tcBorders>
+      </w:tcPr>
+    </w:tblStylePr>
+    <w:tblStylePr w:type="lastRow">
+      <w:rPr>
+        <w:b/>
+        <w:color w:val="404040"/>
+      </w:rPr>
+      <w:pPr>
+        <w:pBdr/>
+        <w:spacing/>
+        <w:ind/>
+      </w:pPr>
+      <w:tblPr>
+        <w:tblBorders/>
+      </w:tblPr>
+      <w:tcPr>
+        <w:shd w:val="clear" w:color="ffffff"/>
+        <w:tcBorders>
+          <w:top w:val="none" w:color="000000" w:sz="4" w:space="0"/>
+          <w:left w:val="none" w:color="000000" w:sz="4" w:space="0"/>
+          <w:bottom w:val="none" w:color="000000" w:sz="4" w:space="0"/>
+          <w:right w:val="none" w:color="000000" w:sz="4" w:space="0"/>
+        </w:tcBorders>
+      </w:tcPr>
+    </w:tblStylePr>
     <w:tblStylePr w:type="nwCell">
       <w:pPr>
         <w:pBdr/>
@@ -7444,9 +7500,9 @@
       </w:tcPr>
     </w:tblStylePr>
   </w:style>
-  <w:style w:type="table" w:styleId="35">
+  <w:style w:type="table" w:styleId="724">
     <w:name w:val="Grid Table 3 - Accent 2"/>
-    <w:basedOn w:val="665"/>
+    <w:basedOn w:val="887"/>
     <w:uiPriority w:val="99"/>
     <w:pPr>
       <w:pBdr/>
@@ -7545,29 +7601,6 @@
         <w:tblBorders/>
       </w:tblPr>
       <w:tcPr>
-        <w:shd w:color="ffffff"/>
-        <w:tcBorders>
-          <w:top w:val="none" w:color="000000" w:sz="4" w:space="0"/>
-          <w:left w:val="none" w:color="000000" w:sz="4" w:space="0"/>
-          <w:bottom w:val="none" w:color="000000" w:sz="4" w:space="0"/>
-          <w:right w:val="none" w:color="000000" w:sz="4" w:space="0"/>
-        </w:tcBorders>
-      </w:tcPr>
-    </w:tblStylePr>
-    <w:tblStylePr w:type="firstRow">
-      <w:rPr>
-        <w:b/>
-        <w:color w:val="404040"/>
-      </w:rPr>
-      <w:pPr>
-        <w:pBdr/>
-        <w:spacing/>
-        <w:ind/>
-      </w:pPr>
-      <w:tblPr>
-        <w:tblBorders/>
-      </w:tblPr>
-      <w:tcPr>
         <w:shd w:val="clear" w:color="ffffff"/>
         <w:tcBorders>
           <w:top w:val="none" w:color="000000" w:sz="4" w:space="0"/>
@@ -7577,30 +7610,7 @@
         </w:tcBorders>
       </w:tcPr>
     </w:tblStylePr>
-    <w:tblStylePr w:type="lastCol">
-      <w:rPr>
-        <w:i/>
-        <w:color w:val="404040"/>
-      </w:rPr>
-      <w:pPr>
-        <w:pBdr/>
-        <w:spacing/>
-        <w:ind/>
-      </w:pPr>
-      <w:tblPr>
-        <w:tblBorders/>
-      </w:tblPr>
-      <w:tcPr>
-        <w:shd w:color="ffffff"/>
-        <w:tcBorders>
-          <w:top w:val="none" w:color="000000" w:sz="4" w:space="0"/>
-          <w:left w:val="none" w:color="000000" w:sz="4" w:space="0"/>
-          <w:bottom w:val="none" w:color="000000" w:sz="4" w:space="0"/>
-          <w:right w:val="none" w:color="000000" w:sz="4" w:space="0"/>
-        </w:tcBorders>
-      </w:tcPr>
-    </w:tblStylePr>
-    <w:tblStylePr w:type="lastRow">
+    <w:tblStylePr w:type="firstRow">
       <w:rPr>
         <w:b/>
         <w:color w:val="404040"/>
@@ -7623,6 +7633,52 @@
         </w:tcBorders>
       </w:tcPr>
     </w:tblStylePr>
+    <w:tblStylePr w:type="lastCol">
+      <w:rPr>
+        <w:i/>
+        <w:color w:val="404040"/>
+      </w:rPr>
+      <w:pPr>
+        <w:pBdr/>
+        <w:spacing/>
+        <w:ind/>
+      </w:pPr>
+      <w:tblPr>
+        <w:tblBorders/>
+      </w:tblPr>
+      <w:tcPr>
+        <w:shd w:val="clear" w:color="ffffff"/>
+        <w:tcBorders>
+          <w:top w:val="none" w:color="000000" w:sz="4" w:space="0"/>
+          <w:left w:val="none" w:color="000000" w:sz="4" w:space="0"/>
+          <w:bottom w:val="none" w:color="000000" w:sz="4" w:space="0"/>
+          <w:right w:val="none" w:color="000000" w:sz="4" w:space="0"/>
+        </w:tcBorders>
+      </w:tcPr>
+    </w:tblStylePr>
+    <w:tblStylePr w:type="lastRow">
+      <w:rPr>
+        <w:b/>
+        <w:color w:val="404040"/>
+      </w:rPr>
+      <w:pPr>
+        <w:pBdr/>
+        <w:spacing/>
+        <w:ind/>
+      </w:pPr>
+      <w:tblPr>
+        <w:tblBorders/>
+      </w:tblPr>
+      <w:tcPr>
+        <w:shd w:val="clear" w:color="ffffff"/>
+        <w:tcBorders>
+          <w:top w:val="none" w:color="000000" w:sz="4" w:space="0"/>
+          <w:left w:val="none" w:color="000000" w:sz="4" w:space="0"/>
+          <w:bottom w:val="none" w:color="000000" w:sz="4" w:space="0"/>
+          <w:right w:val="none" w:color="000000" w:sz="4" w:space="0"/>
+        </w:tcBorders>
+      </w:tcPr>
+    </w:tblStylePr>
     <w:tblStylePr w:type="nwCell">
       <w:pPr>
         <w:pBdr/>
@@ -7689,9 +7745,9 @@
       </w:tcPr>
     </w:tblStylePr>
   </w:style>
-  <w:style w:type="table" w:styleId="36">
+  <w:style w:type="table" w:styleId="725">
     <w:name w:val="Grid Table 3 - Accent 3"/>
-    <w:basedOn w:val="665"/>
+    <w:basedOn w:val="887"/>
     <w:uiPriority w:val="99"/>
     <w:pPr>
       <w:pBdr/>
@@ -7790,29 +7846,6 @@
         <w:tblBorders/>
       </w:tblPr>
       <w:tcPr>
-        <w:shd w:color="ffffff"/>
-        <w:tcBorders>
-          <w:top w:val="none" w:color="000000" w:sz="4" w:space="0"/>
-          <w:left w:val="none" w:color="000000" w:sz="4" w:space="0"/>
-          <w:bottom w:val="none" w:color="000000" w:sz="4" w:space="0"/>
-          <w:right w:val="none" w:color="000000" w:sz="4" w:space="0"/>
-        </w:tcBorders>
-      </w:tcPr>
-    </w:tblStylePr>
-    <w:tblStylePr w:type="firstRow">
-      <w:rPr>
-        <w:b/>
-        <w:color w:val="404040"/>
-      </w:rPr>
-      <w:pPr>
-        <w:pBdr/>
-        <w:spacing/>
-        <w:ind/>
-      </w:pPr>
-      <w:tblPr>
-        <w:tblBorders/>
-      </w:tblPr>
-      <w:tcPr>
         <w:shd w:val="clear" w:color="ffffff"/>
         <w:tcBorders>
           <w:top w:val="none" w:color="000000" w:sz="4" w:space="0"/>
@@ -7822,30 +7855,7 @@
         </w:tcBorders>
       </w:tcPr>
     </w:tblStylePr>
-    <w:tblStylePr w:type="lastCol">
-      <w:rPr>
-        <w:i/>
-        <w:color w:val="404040"/>
-      </w:rPr>
-      <w:pPr>
-        <w:pBdr/>
-        <w:spacing/>
-        <w:ind/>
-      </w:pPr>
-      <w:tblPr>
-        <w:tblBorders/>
-      </w:tblPr>
-      <w:tcPr>
-        <w:shd w:color="ffffff"/>
-        <w:tcBorders>
-          <w:top w:val="none" w:color="000000" w:sz="4" w:space="0"/>
-          <w:left w:val="none" w:color="000000" w:sz="4" w:space="0"/>
-          <w:bottom w:val="none" w:color="000000" w:sz="4" w:space="0"/>
-          <w:right w:val="none" w:color="000000" w:sz="4" w:space="0"/>
-        </w:tcBorders>
-      </w:tcPr>
-    </w:tblStylePr>
-    <w:tblStylePr w:type="lastRow">
+    <w:tblStylePr w:type="firstRow">
       <w:rPr>
         <w:b/>
         <w:color w:val="404040"/>
@@ -7868,6 +7878,52 @@
         </w:tcBorders>
       </w:tcPr>
     </w:tblStylePr>
+    <w:tblStylePr w:type="lastCol">
+      <w:rPr>
+        <w:i/>
+        <w:color w:val="404040"/>
+      </w:rPr>
+      <w:pPr>
+        <w:pBdr/>
+        <w:spacing/>
+        <w:ind/>
+      </w:pPr>
+      <w:tblPr>
+        <w:tblBorders/>
+      </w:tblPr>
+      <w:tcPr>
+        <w:shd w:val="clear" w:color="ffffff"/>
+        <w:tcBorders>
+          <w:top w:val="none" w:color="000000" w:sz="4" w:space="0"/>
+          <w:left w:val="none" w:color="000000" w:sz="4" w:space="0"/>
+          <w:bottom w:val="none" w:color="000000" w:sz="4" w:space="0"/>
+          <w:right w:val="none" w:color="000000" w:sz="4" w:space="0"/>
+        </w:tcBorders>
+      </w:tcPr>
+    </w:tblStylePr>
+    <w:tblStylePr w:type="lastRow">
+      <w:rPr>
+        <w:b/>
+        <w:color w:val="404040"/>
+      </w:rPr>
+      <w:pPr>
+        <w:pBdr/>
+        <w:spacing/>
+        <w:ind/>
+      </w:pPr>
+      <w:tblPr>
+        <w:tblBorders/>
+      </w:tblPr>
+      <w:tcPr>
+        <w:shd w:val="clear" w:color="ffffff"/>
+        <w:tcBorders>
+          <w:top w:val="none" w:color="000000" w:sz="4" w:space="0"/>
+          <w:left w:val="none" w:color="000000" w:sz="4" w:space="0"/>
+          <w:bottom w:val="none" w:color="000000" w:sz="4" w:space="0"/>
+          <w:right w:val="none" w:color="000000" w:sz="4" w:space="0"/>
+        </w:tcBorders>
+      </w:tcPr>
+    </w:tblStylePr>
     <w:tblStylePr w:type="nwCell">
       <w:pPr>
         <w:pBdr/>
@@ -7934,9 +7990,9 @@
       </w:tcPr>
     </w:tblStylePr>
   </w:style>
-  <w:style w:type="table" w:styleId="37">
+  <w:style w:type="table" w:styleId="726">
     <w:name w:val="Grid Table 3 - Accent 4"/>
-    <w:basedOn w:val="665"/>
+    <w:basedOn w:val="887"/>
     <w:uiPriority w:val="99"/>
     <w:pPr>
       <w:pBdr/>
@@ -8035,29 +8091,6 @@
         <w:tblBorders/>
       </w:tblPr>
       <w:tcPr>
-        <w:shd w:color="ffffff"/>
-        <w:tcBorders>
-          <w:top w:val="none" w:color="000000" w:sz="4" w:space="0"/>
-          <w:left w:val="none" w:color="000000" w:sz="4" w:space="0"/>
-          <w:bottom w:val="none" w:color="000000" w:sz="4" w:space="0"/>
-          <w:right w:val="none" w:color="000000" w:sz="4" w:space="0"/>
-        </w:tcBorders>
-      </w:tcPr>
-    </w:tblStylePr>
-    <w:tblStylePr w:type="firstRow">
-      <w:rPr>
-        <w:b/>
-        <w:color w:val="404040"/>
-      </w:rPr>
-      <w:pPr>
-        <w:pBdr/>
-        <w:spacing/>
-        <w:ind/>
-      </w:pPr>
-      <w:tblPr>
-        <w:tblBorders/>
-      </w:tblPr>
-      <w:tcPr>
         <w:shd w:val="clear" w:color="ffffff"/>
         <w:tcBorders>
           <w:top w:val="none" w:color="000000" w:sz="4" w:space="0"/>
@@ -8067,30 +8100,7 @@
         </w:tcBorders>
       </w:tcPr>
     </w:tblStylePr>
-    <w:tblStylePr w:type="lastCol">
-      <w:rPr>
-        <w:i/>
-        <w:color w:val="404040"/>
-      </w:rPr>
-      <w:pPr>
-        <w:pBdr/>
-        <w:spacing/>
-        <w:ind/>
-      </w:pPr>
-      <w:tblPr>
-        <w:tblBorders/>
-      </w:tblPr>
-      <w:tcPr>
-        <w:shd w:color="ffffff"/>
-        <w:tcBorders>
-          <w:top w:val="none" w:color="000000" w:sz="4" w:space="0"/>
-          <w:left w:val="none" w:color="000000" w:sz="4" w:space="0"/>
-          <w:bottom w:val="none" w:color="000000" w:sz="4" w:space="0"/>
-          <w:right w:val="none" w:color="000000" w:sz="4" w:space="0"/>
-        </w:tcBorders>
-      </w:tcPr>
-    </w:tblStylePr>
-    <w:tblStylePr w:type="lastRow">
+    <w:tblStylePr w:type="firstRow">
       <w:rPr>
         <w:b/>
         <w:color w:val="404040"/>
@@ -8113,6 +8123,52 @@
         </w:tcBorders>
       </w:tcPr>
     </w:tblStylePr>
+    <w:tblStylePr w:type="lastCol">
+      <w:rPr>
+        <w:i/>
+        <w:color w:val="404040"/>
+      </w:rPr>
+      <w:pPr>
+        <w:pBdr/>
+        <w:spacing/>
+        <w:ind/>
+      </w:pPr>
+      <w:tblPr>
+        <w:tblBorders/>
+      </w:tblPr>
+      <w:tcPr>
+        <w:shd w:val="clear" w:color="ffffff"/>
+        <w:tcBorders>
+          <w:top w:val="none" w:color="000000" w:sz="4" w:space="0"/>
+          <w:left w:val="none" w:color="000000" w:sz="4" w:space="0"/>
+          <w:bottom w:val="none" w:color="000000" w:sz="4" w:space="0"/>
+          <w:right w:val="none" w:color="000000" w:sz="4" w:space="0"/>
+        </w:tcBorders>
+      </w:tcPr>
+    </w:tblStylePr>
+    <w:tblStylePr w:type="lastRow">
+      <w:rPr>
+        <w:b/>
+        <w:color w:val="404040"/>
+      </w:rPr>
+      <w:pPr>
+        <w:pBdr/>
+        <w:spacing/>
+        <w:ind/>
+      </w:pPr>
+      <w:tblPr>
+        <w:tblBorders/>
+      </w:tblPr>
+      <w:tcPr>
+        <w:shd w:val="clear" w:color="ffffff"/>
+        <w:tcBorders>
+          <w:top w:val="none" w:color="000000" w:sz="4" w:space="0"/>
+          <w:left w:val="none" w:color="000000" w:sz="4" w:space="0"/>
+          <w:bottom w:val="none" w:color="000000" w:sz="4" w:space="0"/>
+          <w:right w:val="none" w:color="000000" w:sz="4" w:space="0"/>
+        </w:tcBorders>
+      </w:tcPr>
+    </w:tblStylePr>
     <w:tblStylePr w:type="nwCell">
       <w:pPr>
         <w:pBdr/>
@@ -8179,9 +8235,9 @@
       </w:tcPr>
     </w:tblStylePr>
   </w:style>
-  <w:style w:type="table" w:styleId="38">
+  <w:style w:type="table" w:styleId="727">
     <w:name w:val="Grid Table 3 - Accent 5"/>
-    <w:basedOn w:val="665"/>
+    <w:basedOn w:val="887"/>
     <w:uiPriority w:val="99"/>
     <w:pPr>
       <w:pBdr/>
@@ -8280,29 +8336,6 @@
         <w:tblBorders/>
       </w:tblPr>
       <w:tcPr>
-        <w:shd w:color="ffffff"/>
-        <w:tcBorders>
-          <w:top w:val="none" w:color="000000" w:sz="4" w:space="0"/>
-          <w:left w:val="none" w:color="000000" w:sz="4" w:space="0"/>
-          <w:bottom w:val="none" w:color="000000" w:sz="4" w:space="0"/>
-          <w:right w:val="none" w:color="000000" w:sz="4" w:space="0"/>
-        </w:tcBorders>
-      </w:tcPr>
-    </w:tblStylePr>
-    <w:tblStylePr w:type="firstRow">
-      <w:rPr>
-        <w:b/>
-        <w:color w:val="404040"/>
-      </w:rPr>
-      <w:pPr>
-        <w:pBdr/>
-        <w:spacing/>
-        <w:ind/>
-      </w:pPr>
-      <w:tblPr>
-        <w:tblBorders/>
-      </w:tblPr>
-      <w:tcPr>
         <w:shd w:val="clear" w:color="ffffff"/>
         <w:tcBorders>
           <w:top w:val="none" w:color="000000" w:sz="4" w:space="0"/>
@@ -8312,30 +8345,7 @@
         </w:tcBorders>
       </w:tcPr>
     </w:tblStylePr>
-    <w:tblStylePr w:type="lastCol">
-      <w:rPr>
-        <w:i/>
-        <w:color w:val="404040"/>
-      </w:rPr>
-      <w:pPr>
-        <w:pBdr/>
-        <w:spacing/>
-        <w:ind/>
-      </w:pPr>
-      <w:tblPr>
-        <w:tblBorders/>
-      </w:tblPr>
-      <w:tcPr>
-        <w:shd w:color="ffffff"/>
-        <w:tcBorders>
-          <w:top w:val="none" w:color="000000" w:sz="4" w:space="0"/>
-          <w:left w:val="none" w:color="000000" w:sz="4" w:space="0"/>
-          <w:bottom w:val="none" w:color="000000" w:sz="4" w:space="0"/>
-          <w:right w:val="none" w:color="000000" w:sz="4" w:space="0"/>
-        </w:tcBorders>
-      </w:tcPr>
-    </w:tblStylePr>
-    <w:tblStylePr w:type="lastRow">
+    <w:tblStylePr w:type="firstRow">
       <w:rPr>
         <w:b/>
         <w:color w:val="404040"/>
@@ -8358,6 +8368,52 @@
         </w:tcBorders>
       </w:tcPr>
     </w:tblStylePr>
+    <w:tblStylePr w:type="lastCol">
+      <w:rPr>
+        <w:i/>
+        <w:color w:val="404040"/>
+      </w:rPr>
+      <w:pPr>
+        <w:pBdr/>
+        <w:spacing/>
+        <w:ind/>
+      </w:pPr>
+      <w:tblPr>
+        <w:tblBorders/>
+      </w:tblPr>
+      <w:tcPr>
+        <w:shd w:val="clear" w:color="ffffff"/>
+        <w:tcBorders>
+          <w:top w:val="none" w:color="000000" w:sz="4" w:space="0"/>
+          <w:left w:val="none" w:color="000000" w:sz="4" w:space="0"/>
+          <w:bottom w:val="none" w:color="000000" w:sz="4" w:space="0"/>
+          <w:right w:val="none" w:color="000000" w:sz="4" w:space="0"/>
+        </w:tcBorders>
+      </w:tcPr>
+    </w:tblStylePr>
+    <w:tblStylePr w:type="lastRow">
+      <w:rPr>
+        <w:b/>
+        <w:color w:val="404040"/>
+      </w:rPr>
+      <w:pPr>
+        <w:pBdr/>
+        <w:spacing/>
+        <w:ind/>
+      </w:pPr>
+      <w:tblPr>
+        <w:tblBorders/>
+      </w:tblPr>
+      <w:tcPr>
+        <w:shd w:val="clear" w:color="ffffff"/>
+        <w:tcBorders>
+          <w:top w:val="none" w:color="000000" w:sz="4" w:space="0"/>
+          <w:left w:val="none" w:color="000000" w:sz="4" w:space="0"/>
+          <w:bottom w:val="none" w:color="000000" w:sz="4" w:space="0"/>
+          <w:right w:val="none" w:color="000000" w:sz="4" w:space="0"/>
+        </w:tcBorders>
+      </w:tcPr>
+    </w:tblStylePr>
     <w:tblStylePr w:type="nwCell">
       <w:pPr>
         <w:pBdr/>
@@ -8424,9 +8480,9 @@
       </w:tcPr>
     </w:tblStylePr>
   </w:style>
-  <w:style w:type="table" w:styleId="39">
+  <w:style w:type="table" w:styleId="728">
     <w:name w:val="Grid Table 3 - Accent 6"/>
-    <w:basedOn w:val="665"/>
+    <w:basedOn w:val="887"/>
     <w:uiPriority w:val="99"/>
     <w:pPr>
       <w:pBdr/>
@@ -8525,29 +8581,6 @@
         <w:tblBorders/>
       </w:tblPr>
       <w:tcPr>
-        <w:shd w:color="ffffff"/>
-        <w:tcBorders>
-          <w:top w:val="none" w:color="000000" w:sz="4" w:space="0"/>
-          <w:left w:val="none" w:color="000000" w:sz="4" w:space="0"/>
-          <w:bottom w:val="none" w:color="000000" w:sz="4" w:space="0"/>
-          <w:right w:val="none" w:color="000000" w:sz="4" w:space="0"/>
-        </w:tcBorders>
-      </w:tcPr>
-    </w:tblStylePr>
-    <w:tblStylePr w:type="firstRow">
-      <w:rPr>
-        <w:b/>
-        <w:color w:val="404040"/>
-      </w:rPr>
-      <w:pPr>
-        <w:pBdr/>
-        <w:spacing/>
-        <w:ind/>
-      </w:pPr>
-      <w:tblPr>
-        <w:tblBorders/>
-      </w:tblPr>
-      <w:tcPr>
         <w:shd w:val="clear" w:color="ffffff"/>
         <w:tcBorders>
           <w:top w:val="none" w:color="000000" w:sz="4" w:space="0"/>
@@ -8557,30 +8590,7 @@
         </w:tcBorders>
       </w:tcPr>
     </w:tblStylePr>
-    <w:tblStylePr w:type="lastCol">
-      <w:rPr>
-        <w:i/>
-        <w:color w:val="404040"/>
-      </w:rPr>
-      <w:pPr>
-        <w:pBdr/>
-        <w:spacing/>
-        <w:ind/>
-      </w:pPr>
-      <w:tblPr>
-        <w:tblBorders/>
-      </w:tblPr>
-      <w:tcPr>
-        <w:shd w:color="ffffff"/>
-        <w:tcBorders>
-          <w:top w:val="none" w:color="000000" w:sz="4" w:space="0"/>
-          <w:left w:val="none" w:color="000000" w:sz="4" w:space="0"/>
-          <w:bottom w:val="none" w:color="000000" w:sz="4" w:space="0"/>
-          <w:right w:val="none" w:color="000000" w:sz="4" w:space="0"/>
-        </w:tcBorders>
-      </w:tcPr>
-    </w:tblStylePr>
-    <w:tblStylePr w:type="lastRow">
+    <w:tblStylePr w:type="firstRow">
       <w:rPr>
         <w:b/>
         <w:color w:val="404040"/>
@@ -8603,6 +8613,52 @@
         </w:tcBorders>
       </w:tcPr>
     </w:tblStylePr>
+    <w:tblStylePr w:type="lastCol">
+      <w:rPr>
+        <w:i/>
+        <w:color w:val="404040"/>
+      </w:rPr>
+      <w:pPr>
+        <w:pBdr/>
+        <w:spacing/>
+        <w:ind/>
+      </w:pPr>
+      <w:tblPr>
+        <w:tblBorders/>
+      </w:tblPr>
+      <w:tcPr>
+        <w:shd w:val="clear" w:color="ffffff"/>
+        <w:tcBorders>
+          <w:top w:val="none" w:color="000000" w:sz="4" w:space="0"/>
+          <w:left w:val="none" w:color="000000" w:sz="4" w:space="0"/>
+          <w:bottom w:val="none" w:color="000000" w:sz="4" w:space="0"/>
+          <w:right w:val="none" w:color="000000" w:sz="4" w:space="0"/>
+        </w:tcBorders>
+      </w:tcPr>
+    </w:tblStylePr>
+    <w:tblStylePr w:type="lastRow">
+      <w:rPr>
+        <w:b/>
+        <w:color w:val="404040"/>
+      </w:rPr>
+      <w:pPr>
+        <w:pBdr/>
+        <w:spacing/>
+        <w:ind/>
+      </w:pPr>
+      <w:tblPr>
+        <w:tblBorders/>
+      </w:tblPr>
+      <w:tcPr>
+        <w:shd w:val="clear" w:color="ffffff"/>
+        <w:tcBorders>
+          <w:top w:val="none" w:color="000000" w:sz="4" w:space="0"/>
+          <w:left w:val="none" w:color="000000" w:sz="4" w:space="0"/>
+          <w:bottom w:val="none" w:color="000000" w:sz="4" w:space="0"/>
+          <w:right w:val="none" w:color="000000" w:sz="4" w:space="0"/>
+        </w:tcBorders>
+      </w:tcPr>
+    </w:tblStylePr>
     <w:tblStylePr w:type="nwCell">
       <w:pPr>
         <w:pBdr/>
@@ -8669,9 +8725,9 @@
       </w:tcPr>
     </w:tblStylePr>
   </w:style>
-  <w:style w:type="table" w:styleId="40">
+  <w:style w:type="table" w:styleId="729">
     <w:name w:val="Grid Table 4"/>
-    <w:basedOn w:val="665"/>
+    <w:basedOn w:val="887"/>
     <w:uiPriority w:val="59"/>
     <w:pPr>
       <w:pBdr/>
@@ -8902,9 +8958,9 @@
       </w:tcPr>
     </w:tblStylePr>
   </w:style>
-  <w:style w:type="table" w:styleId="41">
+  <w:style w:type="table" w:styleId="730">
     <w:name w:val="Grid Table 4 - Accent 1"/>
-    <w:basedOn w:val="665"/>
+    <w:basedOn w:val="887"/>
     <w:uiPriority w:val="59"/>
     <w:pPr>
       <w:pBdr/>
@@ -9135,9 +9191,9 @@
       </w:tcPr>
     </w:tblStylePr>
   </w:style>
-  <w:style w:type="table" w:styleId="42">
+  <w:style w:type="table" w:styleId="731">
     <w:name w:val="Grid Table 4 - Accent 2"/>
-    <w:basedOn w:val="665"/>
+    <w:basedOn w:val="887"/>
     <w:uiPriority w:val="59"/>
     <w:pPr>
       <w:pBdr/>
@@ -9368,9 +9424,9 @@
       </w:tcPr>
     </w:tblStylePr>
   </w:style>
-  <w:style w:type="table" w:styleId="43">
+  <w:style w:type="table" w:styleId="732">
     <w:name w:val="Grid Table 4 - Accent 3"/>
-    <w:basedOn w:val="665"/>
+    <w:basedOn w:val="887"/>
     <w:uiPriority w:val="59"/>
     <w:pPr>
       <w:pBdr/>
@@ -9601,9 +9657,9 @@
       </w:tcPr>
     </w:tblStylePr>
   </w:style>
-  <w:style w:type="table" w:styleId="44">
+  <w:style w:type="table" w:styleId="733">
     <w:name w:val="Grid Table 4 - Accent 4"/>
-    <w:basedOn w:val="665"/>
+    <w:basedOn w:val="887"/>
     <w:uiPriority w:val="59"/>
     <w:pPr>
       <w:pBdr/>
@@ -9834,9 +9890,9 @@
       </w:tcPr>
     </w:tblStylePr>
   </w:style>
-  <w:style w:type="table" w:styleId="45">
+  <w:style w:type="table" w:styleId="734">
     <w:name w:val="Grid Table 4 - Accent 5"/>
-    <w:basedOn w:val="665"/>
+    <w:basedOn w:val="887"/>
     <w:uiPriority w:val="59"/>
     <w:pPr>
       <w:pBdr/>
@@ -10067,9 +10123,9 @@
       </w:tcPr>
     </w:tblStylePr>
   </w:style>
-  <w:style w:type="table" w:styleId="46">
+  <w:style w:type="table" w:styleId="735">
     <w:name w:val="Grid Table 4 - Accent 6"/>
-    <w:basedOn w:val="665"/>
+    <w:basedOn w:val="887"/>
     <w:uiPriority w:val="59"/>
     <w:pPr>
       <w:pBdr/>
@@ -10300,9 +10356,9 @@
       </w:tcPr>
     </w:tblStylePr>
   </w:style>
-  <w:style w:type="table" w:styleId="47">
+  <w:style w:type="table" w:styleId="736">
     <w:name w:val="Grid Table 5 Dark"/>
-    <w:basedOn w:val="665"/>
+    <w:basedOn w:val="887"/>
     <w:uiPriority w:val="99"/>
     <w:pPr>
       <w:pBdr/>
@@ -10528,9 +10584,9 @@
       </w:tcPr>
     </w:tblStylePr>
   </w:style>
-  <w:style w:type="table" w:styleId="48">
+  <w:style w:type="table" w:styleId="737">
     <w:name w:val="Grid Table 5 Dark- Accent 1"/>
-    <w:basedOn w:val="665"/>
+    <w:basedOn w:val="887"/>
     <w:uiPriority w:val="99"/>
     <w:pPr>
       <w:pBdr/>
@@ -10756,9 +10812,9 @@
       </w:tcPr>
     </w:tblStylePr>
   </w:style>
-  <w:style w:type="table" w:styleId="49">
+  <w:style w:type="table" w:styleId="738">
     <w:name w:val="Grid Table 5 Dark - Accent 2"/>
-    <w:basedOn w:val="665"/>
+    <w:basedOn w:val="887"/>
     <w:uiPriority w:val="99"/>
     <w:pPr>
       <w:pBdr/>
@@ -10984,9 +11040,9 @@
       </w:tcPr>
     </w:tblStylePr>
   </w:style>
-  <w:style w:type="table" w:styleId="50">
+  <w:style w:type="table" w:styleId="739">
     <w:name w:val="Grid Table 5 Dark - Accent 3"/>
-    <w:basedOn w:val="665"/>
+    <w:basedOn w:val="887"/>
     <w:uiPriority w:val="99"/>
     <w:pPr>
       <w:pBdr/>
@@ -11212,9 +11268,9 @@
       </w:tcPr>
     </w:tblStylePr>
   </w:style>
-  <w:style w:type="table" w:styleId="51">
+  <w:style w:type="table" w:styleId="740">
     <w:name w:val="Grid Table 5 Dark- Accent 4"/>
-    <w:basedOn w:val="665"/>
+    <w:basedOn w:val="887"/>
     <w:uiPriority w:val="99"/>
     <w:pPr>
       <w:pBdr/>
@@ -11440,9 +11496,9 @@
       </w:tcPr>
     </w:tblStylePr>
   </w:style>
-  <w:style w:type="table" w:styleId="52">
+  <w:style w:type="table" w:styleId="741">
     <w:name w:val="Grid Table 5 Dark - Accent 5"/>
-    <w:basedOn w:val="665"/>
+    <w:basedOn w:val="887"/>
     <w:uiPriority w:val="99"/>
     <w:pPr>
       <w:pBdr/>
@@ -11668,9 +11724,9 @@
       </w:tcPr>
     </w:tblStylePr>
   </w:style>
-  <w:style w:type="table" w:styleId="53">
+  <w:style w:type="table" w:styleId="742">
     <w:name w:val="Grid Table 5 Dark - Accent 6"/>
-    <w:basedOn w:val="665"/>
+    <w:basedOn w:val="887"/>
     <w:uiPriority w:val="99"/>
     <w:pPr>
       <w:pBdr/>
@@ -11896,9 +11952,9 @@
       </w:tcPr>
     </w:tblStylePr>
   </w:style>
-  <w:style w:type="table" w:styleId="54">
+  <w:style w:type="table" w:styleId="743">
     <w:name w:val="Grid Table 6 Colorful"/>
-    <w:basedOn w:val="665"/>
+    <w:basedOn w:val="887"/>
     <w:uiPriority w:val="99"/>
     <w:pPr>
       <w:pBdr/>
@@ -12126,9 +12182,9 @@
       </w:tcPr>
     </w:tblStylePr>
   </w:style>
-  <w:style w:type="table" w:styleId="55">
+  <w:style w:type="table" w:styleId="744">
     <w:name w:val="Grid Table 6 Colorful - Accent 1"/>
-    <w:basedOn w:val="665"/>
+    <w:basedOn w:val="887"/>
     <w:uiPriority w:val="99"/>
     <w:pPr>
       <w:pBdr/>
@@ -12356,9 +12412,9 @@
       </w:tcPr>
     </w:tblStylePr>
   </w:style>
-  <w:style w:type="table" w:styleId="56">
+  <w:style w:type="table" w:styleId="745">
     <w:name w:val="Grid Table 6 Colorful - Accent 2"/>
-    <w:basedOn w:val="665"/>
+    <w:basedOn w:val="887"/>
     <w:uiPriority w:val="99"/>
     <w:pPr>
       <w:pBdr/>
@@ -12586,9 +12642,9 @@
       </w:tcPr>
     </w:tblStylePr>
   </w:style>
-  <w:style w:type="table" w:styleId="57">
+  <w:style w:type="table" w:styleId="746">
     <w:name w:val="Grid Table 6 Colorful - Accent 3"/>
-    <w:basedOn w:val="665"/>
+    <w:basedOn w:val="887"/>
     <w:uiPriority w:val="99"/>
     <w:pPr>
       <w:pBdr/>
@@ -12816,9 +12872,9 @@
       </w:tcPr>
     </w:tblStylePr>
   </w:style>
-  <w:style w:type="table" w:styleId="58">
+  <w:style w:type="table" w:styleId="747">
     <w:name w:val="Grid Table 6 Colorful - Accent 4"/>
-    <w:basedOn w:val="665"/>
+    <w:basedOn w:val="887"/>
     <w:uiPriority w:val="99"/>
     <w:pPr>
       <w:pBdr/>
@@ -13046,9 +13102,9 @@
       </w:tcPr>
     </w:tblStylePr>
   </w:style>
-  <w:style w:type="table" w:styleId="59">
+  <w:style w:type="table" w:styleId="748">
     <w:name w:val="Grid Table 6 Colorful - Accent 5"/>
-    <w:basedOn w:val="665"/>
+    <w:basedOn w:val="887"/>
     <w:uiPriority w:val="99"/>
     <w:pPr>
       <w:pBdr/>
@@ -13276,9 +13332,9 @@
       </w:tcPr>
     </w:tblStylePr>
   </w:style>
-  <w:style w:type="table" w:styleId="60">
+  <w:style w:type="table" w:styleId="749">
     <w:name w:val="Grid Table 6 Colorful - Accent 6"/>
-    <w:basedOn w:val="665"/>
+    <w:basedOn w:val="887"/>
     <w:uiPriority w:val="99"/>
     <w:pPr>
       <w:pBdr/>
@@ -13506,9 +13562,9 @@
       </w:tcPr>
     </w:tblStylePr>
   </w:style>
-  <w:style w:type="table" w:styleId="61">
+  <w:style w:type="table" w:styleId="750">
     <w:name w:val="Grid Table 7 Colorful"/>
-    <w:basedOn w:val="665"/>
+    <w:basedOn w:val="887"/>
     <w:uiPriority w:val="99"/>
     <w:pPr>
       <w:pBdr/>
@@ -13610,11 +13666,11 @@
         <w:tblBorders/>
       </w:tblPr>
       <w:tcPr>
-        <w:shd w:color="ffffff"/>
+        <w:shd w:val="clear" w:color="ffffff"/>
         <w:tcBorders>
-          <w:top w:val="none"/>
-          <w:left w:val="none"/>
-          <w:bottom w:val="none"/>
+          <w:top w:val="none" w:color="000000" w:sz="4" w:space="0"/>
+          <w:left w:val="none" w:color="000000" w:sz="4" w:space="0"/>
+          <w:bottom w:val="none" w:color="000000" w:sz="4" w:space="0"/>
           <w:right w:val="single" w:color="000000" w:themeColor="text1" w:themeTint="80" w:sz="4" w:space="0"/>
         </w:tcBorders>
       </w:tcPr>
@@ -13637,10 +13693,10 @@
       <w:tcPr>
         <w:shd w:val="clear" w:color="ffffff" w:themeColor="light1" w:fill="ffffff" w:themeFill="light1"/>
         <w:tcBorders>
-          <w:top w:val="none"/>
-          <w:left w:val="none"/>
+          <w:top w:val="none" w:color="000000" w:sz="4" w:space="0"/>
+          <w:left w:val="none" w:color="000000" w:sz="4" w:space="0"/>
           <w:bottom w:val="single" w:color="000000" w:themeColor="text1" w:themeTint="80" w:sz="4" w:space="0"/>
-          <w:right w:val="none"/>
+          <w:right w:val="none" w:color="000000" w:sz="4" w:space="0"/>
         </w:tcBorders>
       </w:tcPr>
     </w:tblStylePr>
@@ -13660,12 +13716,12 @@
         <w:tblBorders/>
       </w:tblPr>
       <w:tcPr>
-        <w:shd w:color="ffffff"/>
+        <w:shd w:val="clear" w:color="ffffff"/>
         <w:tcBorders>
-          <w:top w:val="none"/>
+          <w:top w:val="none" w:color="000000" w:sz="4" w:space="0"/>
           <w:left w:val="single" w:color="000000" w:themeColor="text1" w:themeTint="80" w:sz="4" w:space="0"/>
-          <w:bottom w:val="none"/>
-          <w:right w:val="none"/>
+          <w:bottom w:val="none" w:color="000000" w:sz="4" w:space="0"/>
+          <w:right w:val="none" w:color="000000" w:sz="4" w:space="0"/>
         </w:tcBorders>
       </w:tcPr>
     </w:tblStylePr>
@@ -13688,9 +13744,9 @@
         <w:shd w:val="clear" w:color="ffffff" w:themeColor="light1" w:fill="ffffff" w:themeFill="light1"/>
         <w:tcBorders>
           <w:top w:val="single" w:color="000000" w:themeColor="text1" w:themeTint="80" w:sz="4" w:space="0"/>
-          <w:left w:val="none"/>
-          <w:bottom w:val="none"/>
-          <w:right w:val="none"/>
+          <w:left w:val="none" w:color="000000" w:sz="4" w:space="0"/>
+          <w:bottom w:val="none" w:color="000000" w:sz="4" w:space="0"/>
+          <w:right w:val="none" w:color="000000" w:sz="4" w:space="0"/>
         </w:tcBorders>
       </w:tcPr>
     </w:tblStylePr>
@@ -13760,9 +13816,9 @@
       </w:tcPr>
     </w:tblStylePr>
   </w:style>
-  <w:style w:type="table" w:styleId="62">
+  <w:style w:type="table" w:styleId="751">
     <w:name w:val="Grid Table 7 Colorful - Accent 1"/>
-    <w:basedOn w:val="665"/>
+    <w:basedOn w:val="887"/>
     <w:uiPriority w:val="99"/>
     <w:pPr>
       <w:pBdr/>
@@ -13864,11 +13920,11 @@
         <w:tblBorders/>
       </w:tblPr>
       <w:tcPr>
-        <w:shd w:color="ffffff"/>
+        <w:shd w:val="clear" w:color="ffffff"/>
         <w:tcBorders>
-          <w:top w:val="none"/>
-          <w:left w:val="none"/>
-          <w:bottom w:val="none"/>
+          <w:top w:val="none" w:color="000000" w:sz="4" w:space="0"/>
+          <w:left w:val="none" w:color="000000" w:sz="4" w:space="0"/>
+          <w:bottom w:val="none" w:color="000000" w:sz="4" w:space="0"/>
           <w:right w:val="single" w:color="000000" w:themeColor="accent1" w:themeTint="80" w:sz="4" w:space="0"/>
         </w:tcBorders>
       </w:tcPr>
@@ -13891,10 +13947,10 @@
       <w:tcPr>
         <w:shd w:val="clear" w:color="ffffff" w:themeColor="light1" w:fill="ffffff" w:themeFill="light1"/>
         <w:tcBorders>
-          <w:top w:val="none"/>
-          <w:left w:val="none"/>
+          <w:top w:val="none" w:color="000000" w:sz="4" w:space="0"/>
+          <w:left w:val="none" w:color="000000" w:sz="4" w:space="0"/>
           <w:bottom w:val="single" w:color="000000" w:themeColor="accent1" w:themeTint="80" w:sz="4" w:space="0"/>
-          <w:right w:val="none"/>
+          <w:right w:val="none" w:color="000000" w:sz="4" w:space="0"/>
         </w:tcBorders>
       </w:tcPr>
     </w:tblStylePr>
@@ -13914,12 +13970,12 @@
         <w:tblBorders/>
       </w:tblPr>
       <w:tcPr>
-        <w:shd w:color="ffffff"/>
+        <w:shd w:val="clear" w:color="ffffff"/>
         <w:tcBorders>
-          <w:top w:val="none"/>
+          <w:top w:val="none" w:color="000000" w:sz="4" w:space="0"/>
           <w:left w:val="single" w:color="000000" w:themeColor="accent1" w:themeTint="80" w:sz="4" w:space="0"/>
-          <w:bottom w:val="none"/>
-          <w:right w:val="none"/>
+          <w:bottom w:val="none" w:color="000000" w:sz="4" w:space="0"/>
+          <w:right w:val="none" w:color="000000" w:sz="4" w:space="0"/>
         </w:tcBorders>
       </w:tcPr>
     </w:tblStylePr>
@@ -13942,9 +13998,9 @@
         <w:shd w:val="clear" w:color="ffffff" w:themeColor="light1" w:fill="ffffff" w:themeFill="light1"/>
         <w:tcBorders>
           <w:top w:val="single" w:color="000000" w:themeColor="accent1" w:themeTint="80" w:sz="4" w:space="0"/>
-          <w:left w:val="none"/>
-          <w:bottom w:val="none"/>
-          <w:right w:val="none"/>
+          <w:left w:val="none" w:color="000000" w:sz="4" w:space="0"/>
+          <w:bottom w:val="none" w:color="000000" w:sz="4" w:space="0"/>
+          <w:right w:val="none" w:color="000000" w:sz="4" w:space="0"/>
         </w:tcBorders>
       </w:tcPr>
     </w:tblStylePr>
@@ -14014,9 +14070,9 @@
       </w:tcPr>
     </w:tblStylePr>
   </w:style>
-  <w:style w:type="table" w:styleId="63">
+  <w:style w:type="table" w:styleId="752">
     <w:name w:val="Grid Table 7 Colorful - Accent 2"/>
-    <w:basedOn w:val="665"/>
+    <w:basedOn w:val="887"/>
     <w:uiPriority w:val="99"/>
     <w:pPr>
       <w:pBdr/>
@@ -14118,11 +14174,11 @@
         <w:tblBorders/>
       </w:tblPr>
       <w:tcPr>
-        <w:shd w:color="ffffff"/>
+        <w:shd w:val="clear" w:color="ffffff"/>
         <w:tcBorders>
-          <w:top w:val="none"/>
-          <w:left w:val="none"/>
-          <w:bottom w:val="none"/>
+          <w:top w:val="none" w:color="000000" w:sz="4" w:space="0"/>
+          <w:left w:val="none" w:color="000000" w:sz="4" w:space="0"/>
+          <w:bottom w:val="none" w:color="000000" w:sz="4" w:space="0"/>
           <w:right w:val="single" w:color="000000" w:themeColor="accent2" w:themeTint="97" w:sz="4" w:space="0"/>
         </w:tcBorders>
       </w:tcPr>
@@ -14145,10 +14201,10 @@
       <w:tcPr>
         <w:shd w:val="clear" w:color="ffffff" w:themeColor="light1" w:fill="ffffff" w:themeFill="light1"/>
         <w:tcBorders>
-          <w:top w:val="none"/>
-          <w:left w:val="none"/>
+          <w:top w:val="none" w:color="000000" w:sz="4" w:space="0"/>
+          <w:left w:val="none" w:color="000000" w:sz="4" w:space="0"/>
           <w:bottom w:val="single" w:color="000000" w:themeColor="accent2" w:themeTint="97" w:sz="4" w:space="0"/>
-          <w:right w:val="none"/>
+          <w:right w:val="none" w:color="000000" w:sz="4" w:space="0"/>
         </w:tcBorders>
       </w:tcPr>
     </w:tblStylePr>
@@ -14168,12 +14224,12 @@
         <w:tblBorders/>
       </w:tblPr>
       <w:tcPr>
-        <w:shd w:color="ffffff"/>
+        <w:shd w:val="clear" w:color="ffffff"/>
         <w:tcBorders>
-          <w:top w:val="none"/>
+          <w:top w:val="none" w:color="000000" w:sz="4" w:space="0"/>
           <w:left w:val="single" w:color="000000" w:themeColor="accent2" w:themeTint="97" w:sz="4" w:space="0"/>
-          <w:bottom w:val="none"/>
-          <w:right w:val="none"/>
+          <w:bottom w:val="none" w:color="000000" w:sz="4" w:space="0"/>
+          <w:right w:val="none" w:color="000000" w:sz="4" w:space="0"/>
         </w:tcBorders>
       </w:tcPr>
     </w:tblStylePr>
@@ -14196,9 +14252,9 @@
         <w:shd w:val="clear" w:color="ffffff" w:themeColor="light1" w:fill="ffffff" w:themeFill="light1"/>
         <w:tcBorders>
           <w:top w:val="single" w:color="000000" w:themeColor="accent2" w:themeTint="97" w:sz="4" w:space="0"/>
-          <w:left w:val="none"/>
-          <w:bottom w:val="none"/>
-          <w:right w:val="none"/>
+          <w:left w:val="none" w:color="000000" w:sz="4" w:space="0"/>
+          <w:bottom w:val="none" w:color="000000" w:sz="4" w:space="0"/>
+          <w:right w:val="none" w:color="000000" w:sz="4" w:space="0"/>
         </w:tcBorders>
       </w:tcPr>
     </w:tblStylePr>
@@ -14268,9 +14324,9 @@
       </w:tcPr>
     </w:tblStylePr>
   </w:style>
-  <w:style w:type="table" w:styleId="64">
+  <w:style w:type="table" w:styleId="753">
     <w:name w:val="Grid Table 7 Colorful - Accent 3"/>
-    <w:basedOn w:val="665"/>
+    <w:basedOn w:val="887"/>
     <w:uiPriority w:val="99"/>
     <w:pPr>
       <w:pBdr/>
@@ -14372,11 +14428,11 @@
         <w:tblBorders/>
       </w:tblPr>
       <w:tcPr>
-        <w:shd w:color="ffffff"/>
+        <w:shd w:val="clear" w:color="ffffff"/>
         <w:tcBorders>
-          <w:top w:val="none"/>
-          <w:left w:val="none"/>
-          <w:bottom w:val="none"/>
+          <w:top w:val="none" w:color="000000" w:sz="4" w:space="0"/>
+          <w:left w:val="none" w:color="000000" w:sz="4" w:space="0"/>
+          <w:bottom w:val="none" w:color="000000" w:sz="4" w:space="0"/>
           <w:right w:val="single" w:color="000000" w:themeColor="accent3" w:themeTint="FE" w:sz="4" w:space="0"/>
         </w:tcBorders>
       </w:tcPr>
@@ -14399,10 +14455,10 @@
       <w:tcPr>
         <w:shd w:val="clear" w:color="ffffff" w:themeColor="light1" w:fill="ffffff" w:themeFill="light1"/>
         <w:tcBorders>
-          <w:top w:val="none"/>
-          <w:left w:val="none"/>
+          <w:top w:val="none" w:color="000000" w:sz="4" w:space="0"/>
+          <w:left w:val="none" w:color="000000" w:sz="4" w:space="0"/>
           <w:bottom w:val="single" w:color="000000" w:themeColor="accent3" w:themeTint="FE" w:sz="4" w:space="0"/>
-          <w:right w:val="none"/>
+          <w:right w:val="none" w:color="000000" w:sz="4" w:space="0"/>
         </w:tcBorders>
       </w:tcPr>
     </w:tblStylePr>
@@ -14422,12 +14478,12 @@
         <w:tblBorders/>
       </w:tblPr>
       <w:tcPr>
-        <w:shd w:color="ffffff"/>
+        <w:shd w:val="clear" w:color="ffffff"/>
         <w:tcBorders>
-          <w:top w:val="none"/>
+          <w:top w:val="none" w:color="000000" w:sz="4" w:space="0"/>
           <w:left w:val="single" w:color="000000" w:themeColor="accent3" w:themeTint="FE" w:sz="4" w:space="0"/>
-          <w:bottom w:val="none"/>
-          <w:right w:val="none"/>
+          <w:bottom w:val="none" w:color="000000" w:sz="4" w:space="0"/>
+          <w:right w:val="none" w:color="000000" w:sz="4" w:space="0"/>
         </w:tcBorders>
       </w:tcPr>
     </w:tblStylePr>
@@ -14450,9 +14506,9 @@
         <w:shd w:val="clear" w:color="ffffff" w:themeColor="light1" w:fill="ffffff" w:themeFill="light1"/>
         <w:tcBorders>
           <w:top w:val="single" w:color="000000" w:themeColor="accent3" w:themeTint="FE" w:sz="4" w:space="0"/>
-          <w:left w:val="none"/>
-          <w:bottom w:val="none"/>
-          <w:right w:val="none"/>
+          <w:left w:val="none" w:color="000000" w:sz="4" w:space="0"/>
+          <w:bottom w:val="none" w:color="000000" w:sz="4" w:space="0"/>
+          <w:right w:val="none" w:color="000000" w:sz="4" w:space="0"/>
         </w:tcBorders>
       </w:tcPr>
     </w:tblStylePr>
@@ -14522,9 +14578,9 @@
       </w:tcPr>
     </w:tblStylePr>
   </w:style>
-  <w:style w:type="table" w:styleId="65">
+  <w:style w:type="table" w:styleId="754">
     <w:name w:val="Grid Table 7 Colorful - Accent 4"/>
-    <w:basedOn w:val="665"/>
+    <w:basedOn w:val="887"/>
     <w:uiPriority w:val="99"/>
     <w:pPr>
       <w:pBdr/>
@@ -14626,11 +14682,11 @@
         <w:tblBorders/>
       </w:tblPr>
       <w:tcPr>
-        <w:shd w:color="ffffff"/>
+        <w:shd w:val="clear" w:color="ffffff"/>
         <w:tcBorders>
-          <w:top w:val="none"/>
-          <w:left w:val="none"/>
-          <w:bottom w:val="none"/>
+          <w:top w:val="none" w:color="000000" w:sz="4" w:space="0"/>
+          <w:left w:val="none" w:color="000000" w:sz="4" w:space="0"/>
+          <w:bottom w:val="none" w:color="000000" w:sz="4" w:space="0"/>
           <w:right w:val="single" w:color="000000" w:themeColor="accent4" w:themeTint="9A" w:sz="4" w:space="0"/>
         </w:tcBorders>
       </w:tcPr>
@@ -14653,10 +14709,10 @@
       <w:tcPr>
         <w:shd w:val="clear" w:color="ffffff" w:themeColor="light1" w:fill="ffffff" w:themeFill="light1"/>
         <w:tcBorders>
-          <w:top w:val="none"/>
-          <w:left w:val="none"/>
+          <w:top w:val="none" w:color="000000" w:sz="4" w:space="0"/>
+          <w:left w:val="none" w:color="000000" w:sz="4" w:space="0"/>
           <w:bottom w:val="single" w:color="000000" w:themeColor="accent4" w:themeTint="9A" w:sz="4" w:space="0"/>
-          <w:right w:val="none"/>
+          <w:right w:val="none" w:color="000000" w:sz="4" w:space="0"/>
         </w:tcBorders>
       </w:tcPr>
     </w:tblStylePr>
@@ -14676,12 +14732,12 @@
         <w:tblBorders/>
       </w:tblPr>
       <w:tcPr>
-        <w:shd w:color="ffffff"/>
+        <w:shd w:val="clear" w:color="ffffff"/>
         <w:tcBorders>
-          <w:top w:val="none"/>
+          <w:top w:val="none" w:color="000000" w:sz="4" w:space="0"/>
           <w:left w:val="single" w:color="000000" w:themeColor="accent4" w:themeTint="9A" w:sz="4" w:space="0"/>
-          <w:bottom w:val="none"/>
-          <w:right w:val="none"/>
+          <w:bottom w:val="none" w:color="000000" w:sz="4" w:space="0"/>
+          <w:right w:val="none" w:color="000000" w:sz="4" w:space="0"/>
         </w:tcBorders>
       </w:tcPr>
     </w:tblStylePr>
@@ -14704,9 +14760,9 @@
         <w:shd w:val="clear" w:color="ffffff" w:themeColor="light1" w:fill="ffffff" w:themeFill="light1"/>
         <w:tcBorders>
           <w:top w:val="single" w:color="000000" w:themeColor="accent4" w:themeTint="9A" w:sz="4" w:space="0"/>
-          <w:left w:val="none"/>
-          <w:bottom w:val="none"/>
-          <w:right w:val="none"/>
+          <w:left w:val="none" w:color="000000" w:sz="4" w:space="0"/>
+          <w:bottom w:val="none" w:color="000000" w:sz="4" w:space="0"/>
+          <w:right w:val="none" w:color="000000" w:sz="4" w:space="0"/>
         </w:tcBorders>
       </w:tcPr>
     </w:tblStylePr>
@@ -14776,9 +14832,9 @@
       </w:tcPr>
     </w:tblStylePr>
   </w:style>
-  <w:style w:type="table" w:styleId="66">
+  <w:style w:type="table" w:styleId="755">
     <w:name w:val="Grid Table 7 Colorful - Accent 5"/>
-    <w:basedOn w:val="665"/>
+    <w:basedOn w:val="887"/>
     <w:uiPriority w:val="99"/>
     <w:pPr>
       <w:pBdr/>
@@ -14880,11 +14936,11 @@
         <w:tblBorders/>
       </w:tblPr>
       <w:tcPr>
-        <w:shd w:color="ffffff"/>
+        <w:shd w:val="clear" w:color="ffffff"/>
         <w:tcBorders>
-          <w:top w:val="none"/>
-          <w:left w:val="none"/>
-          <w:bottom w:val="none"/>
+          <w:top w:val="none" w:color="000000" w:sz="4" w:space="0"/>
+          <w:left w:val="none" w:color="000000" w:sz="4" w:space="0"/>
+          <w:bottom w:val="none" w:color="000000" w:sz="4" w:space="0"/>
           <w:right w:val="single" w:color="000000" w:themeColor="accent5" w:themeTint="90" w:sz="4" w:space="0"/>
         </w:tcBorders>
       </w:tcPr>
@@ -14907,10 +14963,10 @@
       <w:tcPr>
         <w:shd w:val="clear" w:color="ffffff" w:themeColor="light1" w:fill="ffffff" w:themeFill="light1"/>
         <w:tcBorders>
-          <w:top w:val="none"/>
-          <w:left w:val="none"/>
+          <w:top w:val="none" w:color="000000" w:sz="4" w:space="0"/>
+          <w:left w:val="none" w:color="000000" w:sz="4" w:space="0"/>
           <w:bottom w:val="single" w:color="000000" w:themeColor="accent5" w:themeTint="90" w:sz="4" w:space="0"/>
-          <w:right w:val="none"/>
+          <w:right w:val="none" w:color="000000" w:sz="4" w:space="0"/>
         </w:tcBorders>
       </w:tcPr>
     </w:tblStylePr>
@@ -14930,12 +14986,12 @@
         <w:tblBorders/>
       </w:tblPr>
       <w:tcPr>
-        <w:shd w:color="ffffff"/>
+        <w:shd w:val="clear" w:color="ffffff"/>
         <w:tcBorders>
-          <w:top w:val="none"/>
+          <w:top w:val="none" w:color="000000" w:sz="4" w:space="0"/>
           <w:left w:val="single" w:color="000000" w:themeColor="accent5" w:themeTint="90" w:sz="4" w:space="0"/>
-          <w:bottom w:val="none"/>
-          <w:right w:val="none"/>
+          <w:bottom w:val="none" w:color="000000" w:sz="4" w:space="0"/>
+          <w:right w:val="none" w:color="000000" w:sz="4" w:space="0"/>
         </w:tcBorders>
       </w:tcPr>
     </w:tblStylePr>
@@ -14958,9 +15014,9 @@
         <w:shd w:val="clear" w:color="ffffff" w:themeColor="light1" w:fill="ffffff" w:themeFill="light1"/>
         <w:tcBorders>
           <w:top w:val="single" w:color="000000" w:themeColor="accent5" w:themeTint="90" w:sz="4" w:space="0"/>
-          <w:left w:val="none"/>
-          <w:bottom w:val="none"/>
-          <w:right w:val="none"/>
+          <w:left w:val="none" w:color="000000" w:sz="4" w:space="0"/>
+          <w:bottom w:val="none" w:color="000000" w:sz="4" w:space="0"/>
+          <w:right w:val="none" w:color="000000" w:sz="4" w:space="0"/>
         </w:tcBorders>
       </w:tcPr>
     </w:tblStylePr>
@@ -15030,9 +15086,9 @@
       </w:tcPr>
     </w:tblStylePr>
   </w:style>
-  <w:style w:type="table" w:styleId="67">
+  <w:style w:type="table" w:styleId="756">
     <w:name w:val="Grid Table 7 Colorful - Accent 6"/>
-    <w:basedOn w:val="665"/>
+    <w:basedOn w:val="887"/>
     <w:uiPriority w:val="99"/>
     <w:pPr>
       <w:pBdr/>
@@ -15134,11 +15190,11 @@
         <w:tblBorders/>
       </w:tblPr>
       <w:tcPr>
-        <w:shd w:color="ffffff"/>
+        <w:shd w:val="clear" w:color="ffffff"/>
         <w:tcBorders>
-          <w:top w:val="none"/>
-          <w:left w:val="none"/>
-          <w:bottom w:val="none"/>
+          <w:top w:val="none" w:color="000000" w:sz="4" w:space="0"/>
+          <w:left w:val="none" w:color="000000" w:sz="4" w:space="0"/>
+          <w:bottom w:val="none" w:color="000000" w:sz="4" w:space="0"/>
           <w:right w:val="single" w:color="000000" w:themeColor="accent6" w:themeTint="90" w:sz="4" w:space="0"/>
         </w:tcBorders>
       </w:tcPr>
@@ -15161,10 +15217,10 @@
       <w:tcPr>
         <w:shd w:val="clear" w:color="ffffff" w:themeColor="light1" w:fill="ffffff" w:themeFill="light1"/>
         <w:tcBorders>
-          <w:top w:val="none"/>
-          <w:left w:val="none"/>
+          <w:top w:val="none" w:color="000000" w:sz="4" w:space="0"/>
+          <w:left w:val="none" w:color="000000" w:sz="4" w:space="0"/>
           <w:bottom w:val="single" w:color="000000" w:themeColor="accent6" w:themeTint="90" w:sz="4" w:space="0"/>
-          <w:right w:val="none"/>
+          <w:right w:val="none" w:color="000000" w:sz="4" w:space="0"/>
         </w:tcBorders>
       </w:tcPr>
     </w:tblStylePr>
@@ -15184,12 +15240,12 @@
         <w:tblBorders/>
       </w:tblPr>
       <w:tcPr>
-        <w:shd w:color="ffffff"/>
+        <w:shd w:val="clear" w:color="ffffff"/>
         <w:tcBorders>
-          <w:top w:val="none"/>
+          <w:top w:val="none" w:color="000000" w:sz="4" w:space="0"/>
           <w:left w:val="single" w:color="000000" w:themeColor="accent6" w:themeTint="90" w:sz="4" w:space="0"/>
-          <w:bottom w:val="none"/>
-          <w:right w:val="none"/>
+          <w:bottom w:val="none" w:color="000000" w:sz="4" w:space="0"/>
+          <w:right w:val="none" w:color="000000" w:sz="4" w:space="0"/>
         </w:tcBorders>
       </w:tcPr>
     </w:tblStylePr>
@@ -15212,9 +15268,9 @@
         <w:shd w:val="clear" w:color="ffffff" w:themeColor="light1" w:fill="ffffff" w:themeFill="light1"/>
         <w:tcBorders>
           <w:top w:val="single" w:color="000000" w:themeColor="accent6" w:themeTint="90" w:sz="4" w:space="0"/>
-          <w:left w:val="none"/>
-          <w:bottom w:val="none"/>
-          <w:right w:val="none"/>
+          <w:left w:val="none" w:color="000000" w:sz="4" w:space="0"/>
+          <w:bottom w:val="none" w:color="000000" w:sz="4" w:space="0"/>
+          <w:right w:val="none" w:color="000000" w:sz="4" w:space="0"/>
         </w:tcBorders>
       </w:tcPr>
     </w:tblStylePr>
@@ -15284,9 +15340,9 @@
       </w:tcPr>
     </w:tblStylePr>
   </w:style>
-  <w:style w:type="table" w:styleId="68">
+  <w:style w:type="table" w:styleId="757">
     <w:name w:val="List Table 1 Light"/>
-    <w:basedOn w:val="665"/>
+    <w:basedOn w:val="887"/>
     <w:uiPriority w:val="99"/>
     <w:pPr>
       <w:pBdr/>
@@ -15500,9 +15556,9 @@
       </w:tcPr>
     </w:tblStylePr>
   </w:style>
-  <w:style w:type="table" w:styleId="69">
+  <w:style w:type="table" w:styleId="758">
     <w:name w:val="List Table 1 Light - Accent 1"/>
-    <w:basedOn w:val="665"/>
+    <w:basedOn w:val="887"/>
     <w:uiPriority w:val="99"/>
     <w:pPr>
       <w:pBdr/>
@@ -15716,9 +15772,9 @@
       </w:tcPr>
     </w:tblStylePr>
   </w:style>
-  <w:style w:type="table" w:styleId="70">
+  <w:style w:type="table" w:styleId="759">
     <w:name w:val="List Table 1 Light - Accent 2"/>
-    <w:basedOn w:val="665"/>
+    <w:basedOn w:val="887"/>
     <w:uiPriority w:val="99"/>
     <w:pPr>
       <w:pBdr/>
@@ -15932,9 +15988,9 @@
       </w:tcPr>
     </w:tblStylePr>
   </w:style>
-  <w:style w:type="table" w:styleId="71">
+  <w:style w:type="table" w:styleId="760">
     <w:name w:val="List Table 1 Light - Accent 3"/>
-    <w:basedOn w:val="665"/>
+    <w:basedOn w:val="887"/>
     <w:uiPriority w:val="99"/>
     <w:pPr>
       <w:pBdr/>
@@ -16148,9 +16204,9 @@
       </w:tcPr>
     </w:tblStylePr>
   </w:style>
-  <w:style w:type="table" w:styleId="72">
+  <w:style w:type="table" w:styleId="761">
     <w:name w:val="List Table 1 Light - Accent 4"/>
-    <w:basedOn w:val="665"/>
+    <w:basedOn w:val="887"/>
     <w:uiPriority w:val="99"/>
     <w:pPr>
       <w:pBdr/>
@@ -16364,9 +16420,9 @@
       </w:tcPr>
     </w:tblStylePr>
   </w:style>
-  <w:style w:type="table" w:styleId="73">
+  <w:style w:type="table" w:styleId="762">
     <w:name w:val="List Table 1 Light - Accent 5"/>
-    <w:basedOn w:val="665"/>
+    <w:basedOn w:val="887"/>
     <w:uiPriority w:val="99"/>
     <w:pPr>
       <w:pBdr/>
@@ -16580,9 +16636,9 @@
       </w:tcPr>
     </w:tblStylePr>
   </w:style>
-  <w:style w:type="table" w:styleId="74">
+  <w:style w:type="table" w:styleId="763">
     <w:name w:val="List Table 1 Light - Accent 6"/>
-    <w:basedOn w:val="665"/>
+    <w:basedOn w:val="887"/>
     <w:uiPriority w:val="99"/>
     <w:pPr>
       <w:pBdr/>
@@ -16796,9 +16852,9 @@
       </w:tcPr>
     </w:tblStylePr>
   </w:style>
-  <w:style w:type="table" w:styleId="75">
+  <w:style w:type="table" w:styleId="764">
     <w:name w:val="List Table 2"/>
-    <w:basedOn w:val="665"/>
+    <w:basedOn w:val="887"/>
     <w:uiPriority w:val="99"/>
     <w:pPr>
       <w:pBdr/>
@@ -17034,9 +17090,9 @@
       </w:tcPr>
     </w:tblStylePr>
   </w:style>
-  <w:style w:type="table" w:styleId="76">
+  <w:style w:type="table" w:styleId="765">
     <w:name w:val="List Table 2 - Accent 1"/>
-    <w:basedOn w:val="665"/>
+    <w:basedOn w:val="887"/>
     <w:uiPriority w:val="99"/>
     <w:pPr>
       <w:pBdr/>
@@ -17272,9 +17328,9 @@
       </w:tcPr>
     </w:tblStylePr>
   </w:style>
-  <w:style w:type="table" w:styleId="77">
+  <w:style w:type="table" w:styleId="766">
     <w:name w:val="List Table 2 - Accent 2"/>
-    <w:basedOn w:val="665"/>
+    <w:basedOn w:val="887"/>
     <w:uiPriority w:val="99"/>
     <w:pPr>
       <w:pBdr/>
@@ -17510,9 +17566,9 @@
       </w:tcPr>
     </w:tblStylePr>
   </w:style>
-  <w:style w:type="table" w:styleId="78">
+  <w:style w:type="table" w:styleId="767">
     <w:name w:val="List Table 2 - Accent 3"/>
-    <w:basedOn w:val="665"/>
+    <w:basedOn w:val="887"/>
     <w:uiPriority w:val="99"/>
     <w:pPr>
       <w:pBdr/>
@@ -17748,9 +17804,9 @@
       </w:tcPr>
     </w:tblStylePr>
   </w:style>
-  <w:style w:type="table" w:styleId="79">
+  <w:style w:type="table" w:styleId="768">
     <w:name w:val="List Table 2 - Accent 4"/>
-    <w:basedOn w:val="665"/>
+    <w:basedOn w:val="887"/>
     <w:uiPriority w:val="99"/>
     <w:pPr>
       <w:pBdr/>
@@ -17986,9 +18042,9 @@
       </w:tcPr>
     </w:tblStylePr>
   </w:style>
-  <w:style w:type="table" w:styleId="80">
+  <w:style w:type="table" w:styleId="769">
     <w:name w:val="List Table 2 - Accent 5"/>
-    <w:basedOn w:val="665"/>
+    <w:basedOn w:val="887"/>
     <w:uiPriority w:val="99"/>
     <w:pPr>
       <w:pBdr/>
@@ -18224,9 +18280,9 @@
       </w:tcPr>
     </w:tblStylePr>
   </w:style>
-  <w:style w:type="table" w:styleId="81">
+  <w:style w:type="table" w:styleId="770">
     <w:name w:val="List Table 2 - Accent 6"/>
-    <w:basedOn w:val="665"/>
+    <w:basedOn w:val="887"/>
     <w:uiPriority w:val="99"/>
     <w:pPr>
       <w:pBdr/>
@@ -18462,9 +18518,9 @@
       </w:tcPr>
     </w:tblStylePr>
   </w:style>
-  <w:style w:type="table" w:styleId="82">
+  <w:style w:type="table" w:styleId="771">
     <w:name w:val="List Table 3"/>
-    <w:basedOn w:val="665"/>
+    <w:basedOn w:val="887"/>
     <w:uiPriority w:val="99"/>
     <w:pPr>
       <w:pBdr/>
@@ -18690,9 +18746,9 @@
       </w:tcPr>
     </w:tblStylePr>
   </w:style>
-  <w:style w:type="table" w:styleId="83">
+  <w:style w:type="table" w:styleId="772">
     <w:name w:val="List Table 3 - Accent 1"/>
-    <w:basedOn w:val="665"/>
+    <w:basedOn w:val="887"/>
     <w:uiPriority w:val="99"/>
     <w:pPr>
       <w:pBdr/>
@@ -18918,9 +18974,9 @@
       </w:tcPr>
     </w:tblStylePr>
   </w:style>
-  <w:style w:type="table" w:styleId="84">
+  <w:style w:type="table" w:styleId="773">
     <w:name w:val="List Table 3 - Accent 2"/>
-    <w:basedOn w:val="665"/>
+    <w:basedOn w:val="887"/>
     <w:uiPriority w:val="99"/>
     <w:pPr>
       <w:pBdr/>
@@ -19146,9 +19202,9 @@
       </w:tcPr>
     </w:tblStylePr>
   </w:style>
-  <w:style w:type="table" w:styleId="85">
+  <w:style w:type="table" w:styleId="774">
     <w:name w:val="List Table 3 - Accent 3"/>
-    <w:basedOn w:val="665"/>
+    <w:basedOn w:val="887"/>
     <w:uiPriority w:val="99"/>
     <w:pPr>
       <w:pBdr/>
@@ -19374,9 +19430,9 @@
       </w:tcPr>
     </w:tblStylePr>
   </w:style>
-  <w:style w:type="table" w:styleId="86">
+  <w:style w:type="table" w:styleId="775">
     <w:name w:val="List Table 3 - Accent 4"/>
-    <w:basedOn w:val="665"/>
+    <w:basedOn w:val="887"/>
     <w:uiPriority w:val="99"/>
     <w:pPr>
       <w:pBdr/>
@@ -19602,9 +19658,9 @@
       </w:tcPr>
     </w:tblStylePr>
   </w:style>
-  <w:style w:type="table" w:styleId="87">
+  <w:style w:type="table" w:styleId="776">
     <w:name w:val="List Table 3 - Accent 5"/>
-    <w:basedOn w:val="665"/>
+    <w:basedOn w:val="887"/>
     <w:uiPriority w:val="99"/>
     <w:pPr>
       <w:pBdr/>
@@ -19830,9 +19886,9 @@
       </w:tcPr>
     </w:tblStylePr>
   </w:style>
-  <w:style w:type="table" w:styleId="88">
+  <w:style w:type="table" w:styleId="777">
     <w:name w:val="List Table 3 - Accent 6"/>
-    <w:basedOn w:val="665"/>
+    <w:basedOn w:val="887"/>
     <w:uiPriority w:val="99"/>
     <w:pPr>
       <w:pBdr/>
@@ -20058,9 +20114,9 @@
       </w:tcPr>
     </w:tblStylePr>
   </w:style>
-  <w:style w:type="table" w:styleId="89">
+  <w:style w:type="table" w:styleId="778">
     <w:name w:val="List Table 4"/>
-    <w:basedOn w:val="665"/>
+    <w:basedOn w:val="887"/>
     <w:uiPriority w:val="99"/>
     <w:pPr>
       <w:pBdr/>
@@ -20283,9 +20339,9 @@
       </w:tcPr>
     </w:tblStylePr>
   </w:style>
-  <w:style w:type="table" w:styleId="90">
+  <w:style w:type="table" w:styleId="779">
     <w:name w:val="List Table 4 - Accent 1"/>
-    <w:basedOn w:val="665"/>
+    <w:basedOn w:val="887"/>
     <w:uiPriority w:val="99"/>
     <w:pPr>
       <w:pBdr/>
@@ -20508,9 +20564,9 @@
       </w:tcPr>
     </w:tblStylePr>
   </w:style>
-  <w:style w:type="table" w:styleId="91">
+  <w:style w:type="table" w:styleId="780">
     <w:name w:val="List Table 4 - Accent 2"/>
-    <w:basedOn w:val="665"/>
+    <w:basedOn w:val="887"/>
     <w:uiPriority w:val="99"/>
     <w:pPr>
       <w:pBdr/>
@@ -20733,9 +20789,9 @@
       </w:tcPr>
     </w:tblStylePr>
   </w:style>
-  <w:style w:type="table" w:styleId="92">
+  <w:style w:type="table" w:styleId="781">
     <w:name w:val="List Table 4 - Accent 3"/>
-    <w:basedOn w:val="665"/>
+    <w:basedOn w:val="887"/>
     <w:uiPriority w:val="99"/>
     <w:pPr>
       <w:pBdr/>
@@ -20958,9 +21014,9 @@
       </w:tcPr>
     </w:tblStylePr>
   </w:style>
-  <w:style w:type="table" w:styleId="93">
+  <w:style w:type="table" w:styleId="782">
     <w:name w:val="List Table 4 - Accent 4"/>
-    <w:basedOn w:val="665"/>
+    <w:basedOn w:val="887"/>
     <w:uiPriority w:val="99"/>
     <w:pPr>
       <w:pBdr/>
@@ -21183,9 +21239,9 @@
       </w:tcPr>
     </w:tblStylePr>
   </w:style>
-  <w:style w:type="table" w:styleId="94">
+  <w:style w:type="table" w:styleId="783">
     <w:name w:val="List Table 4 - Accent 5"/>
-    <w:basedOn w:val="665"/>
+    <w:basedOn w:val="887"/>
     <w:uiPriority w:val="99"/>
     <w:pPr>
       <w:pBdr/>
@@ -21408,9 +21464,9 @@
       </w:tcPr>
     </w:tblStylePr>
   </w:style>
-  <w:style w:type="table" w:styleId="95">
+  <w:style w:type="table" w:styleId="784">
     <w:name w:val="List Table 4 - Accent 6"/>
-    <w:basedOn w:val="665"/>
+    <w:basedOn w:val="887"/>
     <w:uiPriority w:val="99"/>
     <w:pPr>
       <w:pBdr/>
@@ -21633,9 +21689,9 @@
       </w:tcPr>
     </w:tblStylePr>
   </w:style>
-  <w:style w:type="table" w:styleId="96">
+  <w:style w:type="table" w:styleId="785">
     <w:name w:val="List Table 5 Dark"/>
-    <w:basedOn w:val="665"/>
+    <w:basedOn w:val="887"/>
     <w:uiPriority w:val="99"/>
     <w:pPr>
       <w:pBdr/>
@@ -21875,9 +21931,9 @@
       </w:tcPr>
     </w:tblStylePr>
   </w:style>
-  <w:style w:type="table" w:styleId="97">
+  <w:style w:type="table" w:styleId="786">
     <w:name w:val="List Table 5 Dark - Accent 1"/>
-    <w:basedOn w:val="665"/>
+    <w:basedOn w:val="887"/>
     <w:uiPriority w:val="99"/>
     <w:pPr>
       <w:pBdr/>
@@ -22117,9 +22173,9 @@
       </w:tcPr>
     </w:tblStylePr>
   </w:style>
-  <w:style w:type="table" w:styleId="98">
+  <w:style w:type="table" w:styleId="787">
     <w:name w:val="List Table 5 Dark - Accent 2"/>
-    <w:basedOn w:val="665"/>
+    <w:basedOn w:val="887"/>
     <w:uiPriority w:val="99"/>
     <w:pPr>
       <w:pBdr/>
@@ -22359,9 +22415,9 @@
       </w:tcPr>
     </w:tblStylePr>
   </w:style>
-  <w:style w:type="table" w:styleId="99">
+  <w:style w:type="table" w:styleId="788">
     <w:name w:val="List Table 5 Dark - Accent 3"/>
-    <w:basedOn w:val="665"/>
+    <w:basedOn w:val="887"/>
     <w:uiPriority w:val="99"/>
     <w:pPr>
       <w:pBdr/>
@@ -22601,9 +22657,9 @@
       </w:tcPr>
     </w:tblStylePr>
   </w:style>
-  <w:style w:type="table" w:styleId="100">
+  <w:style w:type="table" w:styleId="789">
     <w:name w:val="List Table 5 Dark - Accent 4"/>
-    <w:basedOn w:val="665"/>
+    <w:basedOn w:val="887"/>
     <w:uiPriority w:val="99"/>
     <w:pPr>
       <w:pBdr/>
@@ -22843,9 +22899,9 @@
       </w:tcPr>
     </w:tblStylePr>
   </w:style>
-  <w:style w:type="table" w:styleId="101">
+  <w:style w:type="table" w:styleId="790">
     <w:name w:val="List Table 5 Dark - Accent 5"/>
-    <w:basedOn w:val="665"/>
+    <w:basedOn w:val="887"/>
     <w:uiPriority w:val="99"/>
     <w:pPr>
       <w:pBdr/>
@@ -23085,9 +23141,9 @@
       </w:tcPr>
     </w:tblStylePr>
   </w:style>
-  <w:style w:type="table" w:styleId="102">
+  <w:style w:type="table" w:styleId="791">
     <w:name w:val="List Table 5 Dark - Accent 6"/>
-    <w:basedOn w:val="665"/>
+    <w:basedOn w:val="887"/>
     <w:uiPriority w:val="99"/>
     <w:pPr>
       <w:pBdr/>
@@ -23327,9 +23383,9 @@
       </w:tcPr>
     </w:tblStylePr>
   </w:style>
-  <w:style w:type="table" w:styleId="103">
+  <w:style w:type="table" w:styleId="792">
     <w:name w:val="List Table 6 Colorful"/>
-    <w:basedOn w:val="665"/>
+    <w:basedOn w:val="887"/>
     <w:uiPriority w:val="99"/>
     <w:pPr>
       <w:pBdr/>
@@ -23550,9 +23606,9 @@
       </w:tcPr>
     </w:tblStylePr>
   </w:style>
-  <w:style w:type="table" w:styleId="104">
+  <w:style w:type="table" w:styleId="793">
     <w:name w:val="List Table 6 Colorful - Accent 1"/>
-    <w:basedOn w:val="665"/>
+    <w:basedOn w:val="887"/>
     <w:uiPriority w:val="99"/>
     <w:pPr>
       <w:pBdr/>
@@ -23773,9 +23829,9 @@
       </w:tcPr>
     </w:tblStylePr>
   </w:style>
-  <w:style w:type="table" w:styleId="105">
+  <w:style w:type="table" w:styleId="794">
     <w:name w:val="List Table 6 Colorful - Accent 2"/>
-    <w:basedOn w:val="665"/>
+    <w:basedOn w:val="887"/>
     <w:uiPriority w:val="99"/>
     <w:pPr>
       <w:pBdr/>
@@ -23996,9 +24052,9 @@
       </w:tcPr>
     </w:tblStylePr>
   </w:style>
-  <w:style w:type="table" w:styleId="106">
+  <w:style w:type="table" w:styleId="795">
     <w:name w:val="List Table 6 Colorful - Accent 3"/>
-    <w:basedOn w:val="665"/>
+    <w:basedOn w:val="887"/>
     <w:uiPriority w:val="99"/>
     <w:pPr>
       <w:pBdr/>
@@ -24219,9 +24275,9 @@
       </w:tcPr>
     </w:tblStylePr>
   </w:style>
-  <w:style w:type="table" w:styleId="107">
+  <w:style w:type="table" w:styleId="796">
     <w:name w:val="List Table 6 Colorful - Accent 4"/>
-    <w:basedOn w:val="665"/>
+    <w:basedOn w:val="887"/>
     <w:uiPriority w:val="99"/>
     <w:pPr>
       <w:pBdr/>
@@ -24442,9 +24498,9 @@
       </w:tcPr>
     </w:tblStylePr>
   </w:style>
-  <w:style w:type="table" w:styleId="108">
+  <w:style w:type="table" w:styleId="797">
     <w:name w:val="List Table 6 Colorful - Accent 5"/>
-    <w:basedOn w:val="665"/>
+    <w:basedOn w:val="887"/>
     <w:uiPriority w:val="99"/>
     <w:pPr>
       <w:pBdr/>
@@ -24665,9 +24721,9 @@
       </w:tcPr>
     </w:tblStylePr>
   </w:style>
-  <w:style w:type="table" w:styleId="109">
+  <w:style w:type="table" w:styleId="798">
     <w:name w:val="List Table 6 Colorful - Accent 6"/>
-    <w:basedOn w:val="665"/>
+    <w:basedOn w:val="887"/>
     <w:uiPriority w:val="99"/>
     <w:pPr>
       <w:pBdr/>
@@ -24888,9 +24944,9 @@
       </w:tcPr>
     </w:tblStylePr>
   </w:style>
-  <w:style w:type="table" w:styleId="110">
+  <w:style w:type="table" w:styleId="799">
     <w:name w:val="List Table 7 Colorful"/>
-    <w:basedOn w:val="665"/>
+    <w:basedOn w:val="887"/>
     <w:uiPriority w:val="99"/>
     <w:pPr>
       <w:pBdr/>
@@ -24989,11 +25045,11 @@
         <w:tblBorders/>
       </w:tblPr>
       <w:tcPr>
-        <w:shd w:color="ffffff"/>
+        <w:shd w:val="clear" w:color="ffffff"/>
         <w:tcBorders>
-          <w:top w:val="none"/>
-          <w:left w:val="none"/>
-          <w:bottom w:val="none"/>
+          <w:top w:val="none" w:color="000000" w:sz="4" w:space="0"/>
+          <w:left w:val="none" w:color="000000" w:sz="4" w:space="0"/>
+          <w:bottom w:val="none" w:color="000000" w:sz="4" w:space="0"/>
           <w:right w:val="single" w:color="000000" w:themeColor="text1" w:themeTint="80" w:sz="4" w:space="0"/>
         </w:tcBorders>
       </w:tcPr>
@@ -25016,10 +25072,10 @@
       <w:tcPr>
         <w:shd w:val="clear" w:color="ffffff" w:themeColor="light1" w:fill="ffffff" w:themeFill="light1"/>
         <w:tcBorders>
-          <w:top w:val="none"/>
-          <w:left w:val="none"/>
+          <w:top w:val="none" w:color="000000" w:sz="4" w:space="0"/>
+          <w:left w:val="none" w:color="000000" w:sz="4" w:space="0"/>
           <w:bottom w:val="single" w:color="000000" w:themeColor="text1" w:themeTint="80" w:sz="4" w:space="0"/>
-          <w:right w:val="none"/>
+          <w:right w:val="none" w:color="000000" w:sz="4" w:space="0"/>
         </w:tcBorders>
       </w:tcPr>
     </w:tblStylePr>
@@ -25039,12 +25095,12 @@
         <w:tblBorders/>
       </w:tblPr>
       <w:tcPr>
-        <w:shd w:color="ffffff"/>
+        <w:shd w:val="clear" w:color="ffffff"/>
         <w:tcBorders>
-          <w:top w:val="none"/>
+          <w:top w:val="none" w:color="000000" w:sz="4" w:space="0"/>
           <w:left w:val="single" w:color="000000" w:themeColor="text1" w:themeTint="80" w:sz="4" w:space="0"/>
-          <w:bottom w:val="none"/>
-          <w:right w:val="none"/>
+          <w:bottom w:val="none" w:color="000000" w:sz="4" w:space="0"/>
+          <w:right w:val="none" w:color="000000" w:sz="4" w:space="0"/>
         </w:tcBorders>
       </w:tcPr>
     </w:tblStylePr>
@@ -25067,9 +25123,9 @@
         <w:shd w:val="clear" w:color="ffffff" w:themeColor="light1" w:fill="ffffff" w:themeFill="light1"/>
         <w:tcBorders>
           <w:top w:val="single" w:color="000000" w:themeColor="text1" w:themeTint="80" w:sz="4" w:space="0"/>
-          <w:left w:val="none"/>
-          <w:bottom w:val="none"/>
-          <w:right w:val="none"/>
+          <w:left w:val="none" w:color="000000" w:sz="4" w:space="0"/>
+          <w:bottom w:val="none" w:color="000000" w:sz="4" w:space="0"/>
+          <w:right w:val="none" w:color="000000" w:sz="4" w:space="0"/>
         </w:tcBorders>
       </w:tcPr>
     </w:tblStylePr>
@@ -25144,9 +25200,9 @@
       </w:tcPr>
     </w:tblStylePr>
   </w:style>
-  <w:style w:type="table" w:styleId="111">
+  <w:style w:type="table" w:styleId="800">
     <w:name w:val="List Table 7 Colorful - Accent 1"/>
-    <w:basedOn w:val="665"/>
+    <w:basedOn w:val="887"/>
     <w:uiPriority w:val="99"/>
     <w:pPr>
       <w:pBdr/>
@@ -25245,11 +25301,11 @@
         <w:tblBorders/>
       </w:tblPr>
       <w:tcPr>
-        <w:shd w:color="ffffff"/>
+        <w:shd w:val="clear" w:color="ffffff"/>
         <w:tcBorders>
-          <w:top w:val="none"/>
-          <w:left w:val="none"/>
-          <w:bottom w:val="none"/>
+          <w:top w:val="none" w:color="000000" w:sz="4" w:space="0"/>
+          <w:left w:val="none" w:color="000000" w:sz="4" w:space="0"/>
+          <w:bottom w:val="none" w:color="000000" w:sz="4" w:space="0"/>
           <w:right w:val="single" w:color="000000" w:themeColor="accent1" w:sz="4" w:space="0"/>
         </w:tcBorders>
       </w:tcPr>
@@ -25272,10 +25328,10 @@
       <w:tcPr>
         <w:shd w:val="clear" w:color="ffffff" w:themeColor="light1" w:fill="ffffff" w:themeFill="light1"/>
         <w:tcBorders>
-          <w:top w:val="none"/>
-          <w:left w:val="none"/>
+          <w:top w:val="none" w:color="000000" w:sz="4" w:space="0"/>
+          <w:left w:val="none" w:color="000000" w:sz="4" w:space="0"/>
           <w:bottom w:val="single" w:color="000000" w:themeColor="accent1" w:sz="4" w:space="0"/>
-          <w:right w:val="none"/>
+          <w:right w:val="none" w:color="000000" w:sz="4" w:space="0"/>
         </w:tcBorders>
       </w:tcPr>
     </w:tblStylePr>
@@ -25295,12 +25351,12 @@
         <w:tblBorders/>
       </w:tblPr>
       <w:tcPr>
-        <w:shd w:color="ffffff"/>
+        <w:shd w:val="clear" w:color="ffffff"/>
         <w:tcBorders>
-          <w:top w:val="none"/>
+          <w:top w:val="none" w:color="000000" w:sz="4" w:space="0"/>
           <w:left w:val="single" w:color="000000" w:themeColor="accent1" w:sz="4" w:space="0"/>
-          <w:bottom w:val="none"/>
-          <w:right w:val="none"/>
+          <w:bottom w:val="none" w:color="000000" w:sz="4" w:space="0"/>
+          <w:right w:val="none" w:color="000000" w:sz="4" w:space="0"/>
         </w:tcBorders>
       </w:tcPr>
     </w:tblStylePr>
@@ -25323,9 +25379,9 @@
         <w:shd w:val="clear" w:color="ffffff" w:themeColor="light1" w:fill="ffffff" w:themeFill="light1"/>
         <w:tcBorders>
           <w:top w:val="single" w:color="000000" w:themeColor="accent1" w:sz="4" w:space="0"/>
-          <w:left w:val="none"/>
-          <w:bottom w:val="none"/>
-          <w:right w:val="none"/>
+          <w:left w:val="none" w:color="000000" w:sz="4" w:space="0"/>
+          <w:bottom w:val="none" w:color="000000" w:sz="4" w:space="0"/>
+          <w:right w:val="none" w:color="000000" w:sz="4" w:space="0"/>
         </w:tcBorders>
       </w:tcPr>
     </w:tblStylePr>
@@ -25400,9 +25456,9 @@
       </w:tcPr>
     </w:tblStylePr>
   </w:style>
-  <w:style w:type="table" w:styleId="112">
+  <w:style w:type="table" w:styleId="801">
     <w:name w:val="List Table 7 Colorful - Accent 2"/>
-    <w:basedOn w:val="665"/>
+    <w:basedOn w:val="887"/>
     <w:uiPriority w:val="99"/>
     <w:pPr>
       <w:pBdr/>
@@ -25501,11 +25557,11 @@
         <w:tblBorders/>
       </w:tblPr>
       <w:tcPr>
-        <w:shd w:color="ffffff"/>
+        <w:shd w:val="clear" w:color="ffffff"/>
         <w:tcBorders>
-          <w:top w:val="none"/>
-          <w:left w:val="none"/>
-          <w:bottom w:val="none"/>
+          <w:top w:val="none" w:color="000000" w:sz="4" w:space="0"/>
+          <w:left w:val="none" w:color="000000" w:sz="4" w:space="0"/>
+          <w:bottom w:val="none" w:color="000000" w:sz="4" w:space="0"/>
           <w:right w:val="single" w:color="000000" w:themeColor="accent2" w:themeTint="97" w:sz="4" w:space="0"/>
         </w:tcBorders>
       </w:tcPr>
@@ -25528,10 +25584,10 @@
       <w:tcPr>
         <w:shd w:val="clear" w:color="ffffff" w:themeColor="light1" w:fill="ffffff" w:themeFill="light1"/>
         <w:tcBorders>
-          <w:top w:val="none"/>
-          <w:left w:val="none"/>
+          <w:top w:val="none" w:color="000000" w:sz="4" w:space="0"/>
+          <w:left w:val="none" w:color="000000" w:sz="4" w:space="0"/>
           <w:bottom w:val="single" w:color="000000" w:themeColor="accent2" w:themeTint="97" w:sz="4" w:space="0"/>
-          <w:right w:val="none"/>
+          <w:right w:val="none" w:color="000000" w:sz="4" w:space="0"/>
         </w:tcBorders>
       </w:tcPr>
     </w:tblStylePr>
@@ -25551,12 +25607,12 @@
         <w:tblBorders/>
       </w:tblPr>
       <w:tcPr>
-        <w:shd w:color="ffffff"/>
+        <w:shd w:val="clear" w:color="ffffff"/>
         <w:tcBorders>
-          <w:top w:val="none"/>
+          <w:top w:val="none" w:color="000000" w:sz="4" w:space="0"/>
           <w:left w:val="single" w:color="000000" w:themeColor="accent2" w:themeTint="97" w:sz="4" w:space="0"/>
-          <w:bottom w:val="none"/>
-          <w:right w:val="none"/>
+          <w:bottom w:val="none" w:color="000000" w:sz="4" w:space="0"/>
+          <w:right w:val="none" w:color="000000" w:sz="4" w:space="0"/>
         </w:tcBorders>
       </w:tcPr>
     </w:tblStylePr>
@@ -25579,9 +25635,9 @@
         <w:shd w:val="clear" w:color="ffffff" w:themeColor="light1" w:fill="ffffff" w:themeFill="light1"/>
         <w:tcBorders>
           <w:top w:val="single" w:color="000000" w:themeColor="accent2" w:themeTint="97" w:sz="4" w:space="0"/>
-          <w:left w:val="none"/>
-          <w:bottom w:val="none"/>
-          <w:right w:val="none"/>
+          <w:left w:val="none" w:color="000000" w:sz="4" w:space="0"/>
+          <w:bottom w:val="none" w:color="000000" w:sz="4" w:space="0"/>
+          <w:right w:val="none" w:color="000000" w:sz="4" w:space="0"/>
         </w:tcBorders>
       </w:tcPr>
     </w:tblStylePr>
@@ -25656,9 +25712,9 @@
       </w:tcPr>
     </w:tblStylePr>
   </w:style>
-  <w:style w:type="table" w:styleId="113">
+  <w:style w:type="table" w:styleId="802">
     <w:name w:val="List Table 7 Colorful - Accent 3"/>
-    <w:basedOn w:val="665"/>
+    <w:basedOn w:val="887"/>
     <w:uiPriority w:val="99"/>
     <w:pPr>
       <w:pBdr/>
@@ -25757,11 +25813,11 @@
         <w:tblBorders/>
       </w:tblPr>
       <w:tcPr>
-        <w:shd w:color="ffffff"/>
+        <w:shd w:val="clear" w:color="ffffff"/>
         <w:tcBorders>
-          <w:top w:val="none"/>
-          <w:left w:val="none"/>
-          <w:bottom w:val="none"/>
+          <w:top w:val="none" w:color="000000" w:sz="4" w:space="0"/>
+          <w:left w:val="none" w:color="000000" w:sz="4" w:space="0"/>
+          <w:bottom w:val="none" w:color="000000" w:sz="4" w:space="0"/>
           <w:right w:val="single" w:color="000000" w:themeColor="accent3" w:themeTint="98" w:sz="4" w:space="0"/>
         </w:tcBorders>
       </w:tcPr>
@@ -25784,10 +25840,10 @@
       <w:tcPr>
         <w:shd w:val="clear" w:color="ffffff" w:themeColor="light1" w:fill="ffffff" w:themeFill="light1"/>
         <w:tcBorders>
-          <w:top w:val="none"/>
-          <w:left w:val="none"/>
+          <w:top w:val="none" w:color="000000" w:sz="4" w:space="0"/>
+          <w:left w:val="none" w:color="000000" w:sz="4" w:space="0"/>
           <w:bottom w:val="single" w:color="000000" w:themeColor="accent3" w:themeTint="98" w:sz="4" w:space="0"/>
-          <w:right w:val="none"/>
+          <w:right w:val="none" w:color="000000" w:sz="4" w:space="0"/>
         </w:tcBorders>
       </w:tcPr>
     </w:tblStylePr>
@@ -25807,12 +25863,12 @@
         <w:tblBorders/>
       </w:tblPr>
       <w:tcPr>
-        <w:shd w:color="ffffff"/>
+        <w:shd w:val="clear" w:color="ffffff"/>
         <w:tcBorders>
-          <w:top w:val="none"/>
+          <w:top w:val="none" w:color="000000" w:sz="4" w:space="0"/>
           <w:left w:val="single" w:color="000000" w:themeColor="accent3" w:themeTint="98" w:sz="4" w:space="0"/>
-          <w:bottom w:val="none"/>
-          <w:right w:val="none"/>
+          <w:bottom w:val="none" w:color="000000" w:sz="4" w:space="0"/>
+          <w:right w:val="none" w:color="000000" w:sz="4" w:space="0"/>
         </w:tcBorders>
       </w:tcPr>
     </w:tblStylePr>
@@ -25835,9 +25891,9 @@
         <w:shd w:val="clear" w:color="ffffff" w:themeColor="light1" w:fill="ffffff" w:themeFill="light1"/>
         <w:tcBorders>
           <w:top w:val="single" w:color="000000" w:themeColor="accent3" w:themeTint="98" w:sz="4" w:space="0"/>
-          <w:left w:val="none"/>
-          <w:bottom w:val="none"/>
-          <w:right w:val="none"/>
+          <w:left w:val="none" w:color="000000" w:sz="4" w:space="0"/>
+          <w:bottom w:val="none" w:color="000000" w:sz="4" w:space="0"/>
+          <w:right w:val="none" w:color="000000" w:sz="4" w:space="0"/>
         </w:tcBorders>
       </w:tcPr>
     </w:tblStylePr>
@@ -25912,9 +25968,9 @@
       </w:tcPr>
     </w:tblStylePr>
   </w:style>
-  <w:style w:type="table" w:styleId="114">
+  <w:style w:type="table" w:styleId="803">
     <w:name w:val="List Table 7 Colorful - Accent 4"/>
-    <w:basedOn w:val="665"/>
+    <w:basedOn w:val="887"/>
     <w:uiPriority w:val="99"/>
     <w:pPr>
       <w:pBdr/>
@@ -26013,11 +26069,11 @@
         <w:tblBorders/>
       </w:tblPr>
       <w:tcPr>
-        <w:shd w:color="ffffff"/>
+        <w:shd w:val="clear" w:color="ffffff"/>
         <w:tcBorders>
-          <w:top w:val="none"/>
-          <w:left w:val="none"/>
-          <w:bottom w:val="none"/>
+          <w:top w:val="none" w:color="000000" w:sz="4" w:space="0"/>
+          <w:left w:val="none" w:color="000000" w:sz="4" w:space="0"/>
+          <w:bottom w:val="none" w:color="000000" w:sz="4" w:space="0"/>
           <w:right w:val="single" w:color="000000" w:themeColor="accent4" w:themeTint="9A" w:sz="4" w:space="0"/>
         </w:tcBorders>
       </w:tcPr>
@@ -26040,10 +26096,10 @@
       <w:tcPr>
         <w:shd w:val="clear" w:color="ffffff" w:themeColor="light1" w:fill="ffffff" w:themeFill="light1"/>
         <w:tcBorders>
-          <w:top w:val="none"/>
-          <w:left w:val="none"/>
+          <w:top w:val="none" w:color="000000" w:sz="4" w:space="0"/>
+          <w:left w:val="none" w:color="000000" w:sz="4" w:space="0"/>
           <w:bottom w:val="single" w:color="000000" w:themeColor="accent4" w:themeTint="9A" w:sz="4" w:space="0"/>
-          <w:right w:val="none"/>
+          <w:right w:val="none" w:color="000000" w:sz="4" w:space="0"/>
         </w:tcBorders>
       </w:tcPr>
     </w:tblStylePr>
@@ -26063,12 +26119,12 @@
         <w:tblBorders/>
       </w:tblPr>
       <w:tcPr>
-        <w:shd w:color="ffffff"/>
+        <w:shd w:val="clear" w:color="ffffff"/>
         <w:tcBorders>
-          <w:top w:val="none"/>
+          <w:top w:val="none" w:color="000000" w:sz="4" w:space="0"/>
           <w:left w:val="single" w:color="000000" w:themeColor="accent4" w:themeTint="9A" w:sz="4" w:space="0"/>
-          <w:bottom w:val="none"/>
-          <w:right w:val="none"/>
+          <w:bottom w:val="none" w:color="000000" w:sz="4" w:space="0"/>
+          <w:right w:val="none" w:color="000000" w:sz="4" w:space="0"/>
         </w:tcBorders>
       </w:tcPr>
     </w:tblStylePr>
@@ -26091,9 +26147,9 @@
         <w:shd w:val="clear" w:color="ffffff" w:themeColor="light1" w:fill="ffffff" w:themeFill="light1"/>
         <w:tcBorders>
           <w:top w:val="single" w:color="000000" w:themeColor="accent4" w:themeTint="9A" w:sz="4" w:space="0"/>
-          <w:left w:val="none"/>
-          <w:bottom w:val="none"/>
-          <w:right w:val="none"/>
+          <w:left w:val="none" w:color="000000" w:sz="4" w:space="0"/>
+          <w:bottom w:val="none" w:color="000000" w:sz="4" w:space="0"/>
+          <w:right w:val="none" w:color="000000" w:sz="4" w:space="0"/>
         </w:tcBorders>
       </w:tcPr>
     </w:tblStylePr>
@@ -26168,9 +26224,9 @@
       </w:tcPr>
     </w:tblStylePr>
   </w:style>
-  <w:style w:type="table" w:styleId="115">
+  <w:style w:type="table" w:styleId="804">
     <w:name w:val="List Table 7 Colorful - Accent 5"/>
-    <w:basedOn w:val="665"/>
+    <w:basedOn w:val="887"/>
     <w:uiPriority w:val="99"/>
     <w:pPr>
       <w:pBdr/>
@@ -26269,11 +26325,11 @@
         <w:tblBorders/>
       </w:tblPr>
       <w:tcPr>
-        <w:shd w:color="ffffff"/>
+        <w:shd w:val="clear" w:color="ffffff"/>
         <w:tcBorders>
-          <w:top w:val="none"/>
-          <w:left w:val="none"/>
-          <w:bottom w:val="none"/>
+          <w:top w:val="none" w:color="000000" w:sz="4" w:space="0"/>
+          <w:left w:val="none" w:color="000000" w:sz="4" w:space="0"/>
+          <w:bottom w:val="none" w:color="000000" w:sz="4" w:space="0"/>
           <w:right w:val="single" w:color="000000" w:themeColor="accent5" w:themeTint="9A" w:sz="4" w:space="0"/>
         </w:tcBorders>
       </w:tcPr>
@@ -26296,10 +26352,10 @@
       <w:tcPr>
         <w:shd w:val="clear" w:color="ffffff" w:themeColor="light1" w:fill="ffffff" w:themeFill="light1"/>
         <w:tcBorders>
-          <w:top w:val="none"/>
-          <w:left w:val="none"/>
+          <w:top w:val="none" w:color="000000" w:sz="4" w:space="0"/>
+          <w:left w:val="none" w:color="000000" w:sz="4" w:space="0"/>
           <w:bottom w:val="single" w:color="000000" w:themeColor="accent5" w:themeTint="9A" w:sz="4" w:space="0"/>
-          <w:right w:val="none"/>
+          <w:right w:val="none" w:color="000000" w:sz="4" w:space="0"/>
         </w:tcBorders>
       </w:tcPr>
     </w:tblStylePr>
@@ -26319,12 +26375,12 @@
         <w:tblBorders/>
       </w:tblPr>
       <w:tcPr>
-        <w:shd w:color="ffffff"/>
+        <w:shd w:val="clear" w:color="ffffff"/>
         <w:tcBorders>
-          <w:top w:val="none"/>
+          <w:top w:val="none" w:color="000000" w:sz="4" w:space="0"/>
           <w:left w:val="single" w:color="000000" w:themeColor="accent5" w:themeTint="9A" w:sz="4" w:space="0"/>
-          <w:bottom w:val="none"/>
-          <w:right w:val="none"/>
+          <w:bottom w:val="none" w:color="000000" w:sz="4" w:space="0"/>
+          <w:right w:val="none" w:color="000000" w:sz="4" w:space="0"/>
         </w:tcBorders>
       </w:tcPr>
     </w:tblStylePr>
@@ -26347,9 +26403,9 @@
         <w:shd w:val="clear" w:color="ffffff" w:themeColor="light1" w:fill="ffffff" w:themeFill="light1"/>
         <w:tcBorders>
           <w:top w:val="single" w:color="000000" w:themeColor="accent5" w:themeTint="9A" w:sz="4" w:space="0"/>
-          <w:left w:val="none"/>
-          <w:bottom w:val="none"/>
-          <w:right w:val="none"/>
+          <w:left w:val="none" w:color="000000" w:sz="4" w:space="0"/>
+          <w:bottom w:val="none" w:color="000000" w:sz="4" w:space="0"/>
+          <w:right w:val="none" w:color="000000" w:sz="4" w:space="0"/>
         </w:tcBorders>
       </w:tcPr>
     </w:tblStylePr>
@@ -26424,9 +26480,9 @@
       </w:tcPr>
     </w:tblStylePr>
   </w:style>
-  <w:style w:type="table" w:styleId="116">
+  <w:style w:type="table" w:styleId="805">
     <w:name w:val="List Table 7 Colorful - Accent 6"/>
-    <w:basedOn w:val="665"/>
+    <w:basedOn w:val="887"/>
     <w:uiPriority w:val="99"/>
     <w:pPr>
       <w:pBdr/>
@@ -26525,11 +26581,11 @@
         <w:tblBorders/>
       </w:tblPr>
       <w:tcPr>
-        <w:shd w:color="ffffff"/>
+        <w:shd w:val="clear" w:color="ffffff"/>
         <w:tcBorders>
-          <w:top w:val="none"/>
-          <w:left w:val="none"/>
-          <w:bottom w:val="none"/>
+          <w:top w:val="none" w:color="000000" w:sz="4" w:space="0"/>
+          <w:left w:val="none" w:color="000000" w:sz="4" w:space="0"/>
+          <w:bottom w:val="none" w:color="000000" w:sz="4" w:space="0"/>
           <w:right w:val="single" w:color="000000" w:themeColor="accent6" w:themeTint="98" w:sz="4" w:space="0"/>
         </w:tcBorders>
       </w:tcPr>
@@ -26552,10 +26608,10 @@
       <w:tcPr>
         <w:shd w:val="clear" w:color="ffffff" w:themeColor="light1" w:fill="ffffff" w:themeFill="light1"/>
         <w:tcBorders>
-          <w:top w:val="none"/>
-          <w:left w:val="none"/>
+          <w:top w:val="none" w:color="000000" w:sz="4" w:space="0"/>
+          <w:left w:val="none" w:color="000000" w:sz="4" w:space="0"/>
           <w:bottom w:val="single" w:color="000000" w:themeColor="accent6" w:themeTint="98" w:sz="4" w:space="0"/>
-          <w:right w:val="none"/>
+          <w:right w:val="none" w:color="000000" w:sz="4" w:space="0"/>
         </w:tcBorders>
       </w:tcPr>
     </w:tblStylePr>
@@ -26575,12 +26631,12 @@
         <w:tblBorders/>
       </w:tblPr>
       <w:tcPr>
-        <w:shd w:color="ffffff"/>
+        <w:shd w:val="clear" w:color="ffffff"/>
         <w:tcBorders>
-          <w:top w:val="none"/>
+          <w:top w:val="none" w:color="000000" w:sz="4" w:space="0"/>
           <w:left w:val="single" w:color="000000" w:themeColor="accent6" w:themeTint="98" w:sz="4" w:space="0"/>
-          <w:bottom w:val="none"/>
-          <w:right w:val="none"/>
+          <w:bottom w:val="none" w:color="000000" w:sz="4" w:space="0"/>
+          <w:right w:val="none" w:color="000000" w:sz="4" w:space="0"/>
         </w:tcBorders>
       </w:tcPr>
     </w:tblStylePr>
@@ -26603,9 +26659,9 @@
         <w:shd w:val="clear" w:color="ffffff" w:themeColor="light1" w:fill="ffffff" w:themeFill="light1"/>
         <w:tcBorders>
           <w:top w:val="single" w:color="000000" w:themeColor="accent6" w:themeTint="98" w:sz="4" w:space="0"/>
-          <w:left w:val="none"/>
-          <w:bottom w:val="none"/>
-          <w:right w:val="none"/>
+          <w:left w:val="none" w:color="000000" w:sz="4" w:space="0"/>
+          <w:bottom w:val="none" w:color="000000" w:sz="4" w:space="0"/>
+          <w:right w:val="none" w:color="000000" w:sz="4" w:space="0"/>
         </w:tcBorders>
       </w:tcPr>
     </w:tblStylePr>
@@ -26680,9 +26736,9 @@
       </w:tcPr>
     </w:tblStylePr>
   </w:style>
-  <w:style w:type="table" w:styleId="117">
+  <w:style w:type="table" w:styleId="806">
     <w:name w:val="Lined - Accent"/>
-    <w:basedOn w:val="665"/>
+    <w:basedOn w:val="887"/>
     <w:uiPriority w:val="99"/>
     <w:pPr>
       <w:pBdr/>
@@ -26917,9 +26973,9 @@
       </w:tcPr>
     </w:tblStylePr>
   </w:style>
-  <w:style w:type="table" w:styleId="118">
+  <w:style w:type="table" w:styleId="807">
     <w:name w:val="Lined - Accent 1"/>
-    <w:basedOn w:val="665"/>
+    <w:basedOn w:val="887"/>
     <w:uiPriority w:val="99"/>
     <w:pPr>
       <w:pBdr/>
@@ -27154,9 +27210,9 @@
       </w:tcPr>
     </w:tblStylePr>
   </w:style>
-  <w:style w:type="table" w:styleId="119">
+  <w:style w:type="table" w:styleId="808">
     <w:name w:val="Lined - Accent 2"/>
-    <w:basedOn w:val="665"/>
+    <w:basedOn w:val="887"/>
     <w:uiPriority w:val="99"/>
     <w:pPr>
       <w:pBdr/>
@@ -27391,9 +27447,9 @@
       </w:tcPr>
     </w:tblStylePr>
   </w:style>
-  <w:style w:type="table" w:styleId="120">
+  <w:style w:type="table" w:styleId="809">
     <w:name w:val="Lined - Accent 3"/>
-    <w:basedOn w:val="665"/>
+    <w:basedOn w:val="887"/>
     <w:uiPriority w:val="99"/>
     <w:pPr>
       <w:pBdr/>
@@ -27628,9 +27684,9 @@
       </w:tcPr>
     </w:tblStylePr>
   </w:style>
-  <w:style w:type="table" w:styleId="121">
+  <w:style w:type="table" w:styleId="810">
     <w:name w:val="Lined - Accent 4"/>
-    <w:basedOn w:val="665"/>
+    <w:basedOn w:val="887"/>
     <w:uiPriority w:val="99"/>
     <w:pPr>
       <w:pBdr/>
@@ -27865,9 +27921,9 @@
       </w:tcPr>
     </w:tblStylePr>
   </w:style>
-  <w:style w:type="table" w:styleId="122">
+  <w:style w:type="table" w:styleId="811">
     <w:name w:val="Lined - Accent 5"/>
-    <w:basedOn w:val="665"/>
+    <w:basedOn w:val="887"/>
     <w:uiPriority w:val="99"/>
     <w:pPr>
       <w:pBdr/>
@@ -28102,9 +28158,9 @@
       </w:tcPr>
     </w:tblStylePr>
   </w:style>
-  <w:style w:type="table" w:styleId="123">
+  <w:style w:type="table" w:styleId="812">
     <w:name w:val="Lined - Accent 6"/>
-    <w:basedOn w:val="665"/>
+    <w:basedOn w:val="887"/>
     <w:uiPriority w:val="99"/>
     <w:pPr>
       <w:pBdr/>
@@ -28339,9 +28395,9 @@
       </w:tcPr>
     </w:tblStylePr>
   </w:style>
-  <w:style w:type="table" w:styleId="124">
+  <w:style w:type="table" w:styleId="813">
     <w:name w:val="Bordered &amp; Lined - Accent"/>
-    <w:basedOn w:val="665"/>
+    <w:basedOn w:val="887"/>
     <w:uiPriority w:val="99"/>
     <w:pPr>
       <w:pBdr/>
@@ -28583,9 +28639,9 @@
       </w:tcPr>
     </w:tblStylePr>
   </w:style>
-  <w:style w:type="table" w:styleId="125">
+  <w:style w:type="table" w:styleId="814">
     <w:name w:val="Bordered &amp; Lined - Accent 1"/>
-    <w:basedOn w:val="665"/>
+    <w:basedOn w:val="887"/>
     <w:uiPriority w:val="99"/>
     <w:pPr>
       <w:pBdr/>
@@ -28827,9 +28883,9 @@
       </w:tcPr>
     </w:tblStylePr>
   </w:style>
-  <w:style w:type="table" w:styleId="126">
+  <w:style w:type="table" w:styleId="815">
     <w:name w:val="Bordered &amp; Lined - Accent 2"/>
-    <w:basedOn w:val="665"/>
+    <w:basedOn w:val="887"/>
     <w:uiPriority w:val="99"/>
     <w:pPr>
       <w:pBdr/>
@@ -29071,9 +29127,9 @@
       </w:tcPr>
     </w:tblStylePr>
   </w:style>
-  <w:style w:type="table" w:styleId="127">
+  <w:style w:type="table" w:styleId="816">
     <w:name w:val="Bordered &amp; Lined - Accent 3"/>
-    <w:basedOn w:val="665"/>
+    <w:basedOn w:val="887"/>
     <w:uiPriority w:val="99"/>
     <w:pPr>
       <w:pBdr/>
@@ -29315,9 +29371,9 @@
       </w:tcPr>
     </w:tblStylePr>
   </w:style>
-  <w:style w:type="table" w:styleId="128">
+  <w:style w:type="table" w:styleId="817">
     <w:name w:val="Bordered &amp; Lined - Accent 4"/>
-    <w:basedOn w:val="665"/>
+    <w:basedOn w:val="887"/>
     <w:uiPriority w:val="99"/>
     <w:pPr>
       <w:pBdr/>
@@ -29559,9 +29615,9 @@
       </w:tcPr>
     </w:tblStylePr>
   </w:style>
-  <w:style w:type="table" w:styleId="129">
+  <w:style w:type="table" w:styleId="818">
     <w:name w:val="Bordered &amp; Lined - Accent 5"/>
-    <w:basedOn w:val="665"/>
+    <w:basedOn w:val="887"/>
     <w:uiPriority w:val="99"/>
     <w:pPr>
       <w:pBdr/>
@@ -29803,9 +29859,9 @@
       </w:tcPr>
     </w:tblStylePr>
   </w:style>
-  <w:style w:type="table" w:styleId="130">
+  <w:style w:type="table" w:styleId="819">
     <w:name w:val="Bordered &amp; Lined - Accent 6"/>
-    <w:basedOn w:val="665"/>
+    <w:basedOn w:val="887"/>
     <w:uiPriority w:val="99"/>
     <w:pPr>
       <w:pBdr/>
@@ -30047,9 +30103,9 @@
       </w:tcPr>
     </w:tblStylePr>
   </w:style>
-  <w:style w:type="table" w:styleId="131">
+  <w:style w:type="table" w:styleId="820">
     <w:name w:val="Bordered"/>
-    <w:basedOn w:val="665"/>
+    <w:basedOn w:val="887"/>
     <w:uiPriority w:val="99"/>
     <w:pPr>
       <w:pBdr/>
@@ -30278,9 +30334,9 @@
       </w:tcPr>
     </w:tblStylePr>
   </w:style>
-  <w:style w:type="table" w:styleId="132">
+  <w:style w:type="table" w:styleId="821">
     <w:name w:val="Bordered - Accent 1"/>
-    <w:basedOn w:val="665"/>
+    <w:basedOn w:val="887"/>
     <w:uiPriority w:val="99"/>
     <w:pPr>
       <w:pBdr/>
@@ -30509,9 +30565,9 @@
       </w:tcPr>
     </w:tblStylePr>
   </w:style>
-  <w:style w:type="table" w:styleId="133">
+  <w:style w:type="table" w:styleId="822">
     <w:name w:val="Bordered - Accent 2"/>
-    <w:basedOn w:val="665"/>
+    <w:basedOn w:val="887"/>
     <w:uiPriority w:val="99"/>
     <w:pPr>
       <w:pBdr/>
@@ -30740,9 +30796,9 @@
       </w:tcPr>
     </w:tblStylePr>
   </w:style>
-  <w:style w:type="table" w:styleId="134">
+  <w:style w:type="table" w:styleId="823">
     <w:name w:val="Bordered - Accent 3"/>
-    <w:basedOn w:val="665"/>
+    <w:basedOn w:val="887"/>
     <w:uiPriority w:val="99"/>
     <w:pPr>
       <w:pBdr/>
@@ -30971,9 +31027,9 @@
       </w:tcPr>
     </w:tblStylePr>
   </w:style>
-  <w:style w:type="table" w:styleId="135">
+  <w:style w:type="table" w:styleId="824">
     <w:name w:val="Bordered - Accent 4"/>
-    <w:basedOn w:val="665"/>
+    <w:basedOn w:val="887"/>
     <w:uiPriority w:val="99"/>
     <w:pPr>
       <w:pBdr/>
@@ -31202,9 +31258,9 @@
       </w:tcPr>
     </w:tblStylePr>
   </w:style>
-  <w:style w:type="table" w:styleId="136">
+  <w:style w:type="table" w:styleId="825">
     <w:name w:val="Bordered - Accent 5"/>
-    <w:basedOn w:val="665"/>
+    <w:basedOn w:val="887"/>
     <w:uiPriority w:val="99"/>
     <w:pPr>
       <w:pBdr/>
@@ -31433,9 +31489,9 @@
       </w:tcPr>
     </w:tblStylePr>
   </w:style>
-  <w:style w:type="table" w:styleId="137">
+  <w:style w:type="table" w:styleId="826">
     <w:name w:val="Bordered - Accent 6"/>
-    <w:basedOn w:val="665"/>
+    <w:basedOn w:val="887"/>
     <w:uiPriority w:val="99"/>
     <w:pPr>
       <w:pBdr/>
@@ -31664,11 +31720,11 @@
       </w:tcPr>
     </w:tblStylePr>
   </w:style>
-  <w:style w:type="paragraph" w:styleId="139">
+  <w:style w:type="paragraph" w:styleId="827">
     <w:name w:val="Heading 1"/>
-    <w:basedOn w:val="664"/>
-    <w:next w:val="664"/>
-    <w:link w:val="150"/>
+    <w:basedOn w:val="886"/>
+    <w:next w:val="886"/>
+    <w:link w:val="837"/>
     <w:uiPriority w:val="9"/>
     <w:qFormat/>
     <w:pPr>
@@ -31686,11 +31742,11 @@
       <w:szCs w:val="40"/>
     </w:rPr>
   </w:style>
-  <w:style w:type="paragraph" w:styleId="140">
+  <w:style w:type="paragraph" w:styleId="828">
     <w:name w:val="Heading 2"/>
-    <w:basedOn w:val="664"/>
-    <w:next w:val="664"/>
-    <w:link w:val="151"/>
+    <w:basedOn w:val="886"/>
+    <w:next w:val="886"/>
+    <w:link w:val="838"/>
     <w:uiPriority w:val="9"/>
     <w:unhideWhenUsed/>
     <w:qFormat/>
@@ -31709,11 +31765,11 @@
       <w:szCs w:val="32"/>
     </w:rPr>
   </w:style>
-  <w:style w:type="paragraph" w:styleId="141">
+  <w:style w:type="paragraph" w:styleId="829">
     <w:name w:val="Heading 3"/>
-    <w:basedOn w:val="664"/>
-    <w:next w:val="664"/>
-    <w:link w:val="152"/>
+    <w:basedOn w:val="886"/>
+    <w:next w:val="886"/>
+    <w:link w:val="839"/>
     <w:uiPriority w:val="9"/>
     <w:unhideWhenUsed/>
     <w:qFormat/>
@@ -31732,11 +31788,11 @@
       <w:szCs w:val="28"/>
     </w:rPr>
   </w:style>
-  <w:style w:type="paragraph" w:styleId="142">
+  <w:style w:type="paragraph" w:styleId="830">
     <w:name w:val="Heading 4"/>
-    <w:basedOn w:val="664"/>
-    <w:next w:val="664"/>
-    <w:link w:val="153"/>
+    <w:basedOn w:val="886"/>
+    <w:next w:val="886"/>
+    <w:link w:val="840"/>
     <w:uiPriority w:val="9"/>
     <w:unhideWhenUsed/>
     <w:qFormat/>
@@ -31755,11 +31811,11 @@
       <w:color w:val="0f4761" w:themeColor="accent1" w:themeShade="BF"/>
     </w:rPr>
   </w:style>
-  <w:style w:type="paragraph" w:styleId="143">
+  <w:style w:type="paragraph" w:styleId="831">
     <w:name w:val="Heading 5"/>
-    <w:basedOn w:val="664"/>
-    <w:next w:val="664"/>
-    <w:link w:val="154"/>
+    <w:basedOn w:val="886"/>
+    <w:next w:val="886"/>
+    <w:link w:val="841"/>
     <w:uiPriority w:val="9"/>
     <w:unhideWhenUsed/>
     <w:qFormat/>
@@ -31776,11 +31832,11 @@
       <w:color w:val="0f4761" w:themeColor="accent1" w:themeShade="BF"/>
     </w:rPr>
   </w:style>
-  <w:style w:type="paragraph" w:styleId="144">
+  <w:style w:type="paragraph" w:styleId="832">
     <w:name w:val="Heading 6"/>
-    <w:basedOn w:val="664"/>
-    <w:next w:val="664"/>
-    <w:link w:val="155"/>
+    <w:basedOn w:val="886"/>
+    <w:next w:val="886"/>
+    <w:link w:val="842"/>
     <w:uiPriority w:val="9"/>
     <w:unhideWhenUsed/>
     <w:qFormat/>
@@ -31799,11 +31855,11 @@
       <w:color w:val="595959" w:themeColor="text1" w:themeTint="A6"/>
     </w:rPr>
   </w:style>
-  <w:style w:type="paragraph" w:styleId="145">
+  <w:style w:type="paragraph" w:styleId="833">
     <w:name w:val="Heading 7"/>
-    <w:basedOn w:val="664"/>
-    <w:next w:val="664"/>
-    <w:link w:val="156"/>
+    <w:basedOn w:val="886"/>
+    <w:next w:val="886"/>
+    <w:link w:val="843"/>
     <w:uiPriority w:val="9"/>
     <w:unhideWhenUsed/>
     <w:qFormat/>
@@ -31820,11 +31876,11 @@
       <w:color w:val="595959" w:themeColor="text1" w:themeTint="A6"/>
     </w:rPr>
   </w:style>
-  <w:style w:type="paragraph" w:styleId="146">
+  <w:style w:type="paragraph" w:styleId="834">
     <w:name w:val="Heading 8"/>
-    <w:basedOn w:val="664"/>
-    <w:next w:val="664"/>
-    <w:link w:val="157"/>
+    <w:basedOn w:val="886"/>
+    <w:next w:val="886"/>
+    <w:link w:val="844"/>
     <w:uiPriority w:val="9"/>
     <w:unhideWhenUsed/>
     <w:qFormat/>
@@ -31843,11 +31899,11 @@
       <w:color w:val="272727" w:themeColor="text1" w:themeTint="D8"/>
     </w:rPr>
   </w:style>
-  <w:style w:type="paragraph" w:styleId="147">
+  <w:style w:type="paragraph" w:styleId="835">
     <w:name w:val="Heading 9"/>
-    <w:basedOn w:val="664"/>
-    <w:next w:val="664"/>
-    <w:link w:val="158"/>
+    <w:basedOn w:val="886"/>
+    <w:next w:val="886"/>
+    <w:link w:val="845"/>
     <w:uiPriority w:val="9"/>
     <w:unhideWhenUsed/>
     <w:qFormat/>
@@ -31866,7 +31922,7 @@
       <w:color w:val="272727" w:themeColor="text1" w:themeTint="D8"/>
     </w:rPr>
   </w:style>
-  <w:style w:type="character" w:styleId="148" w:default="1">
+  <w:style w:type="character" w:styleId="836" w:default="1">
     <w:name w:val="Default Paragraph Font"/>
     <w:uiPriority w:val="1"/>
     <w:semiHidden/>
@@ -31877,10 +31933,10 @@
       <w:ind/>
     </w:pPr>
   </w:style>
-  <w:style w:type="character" w:styleId="150">
+  <w:style w:type="character" w:styleId="837">
     <w:name w:val="Heading 1 Char"/>
-    <w:basedOn w:val="148"/>
-    <w:link w:val="139"/>
+    <w:basedOn w:val="836"/>
+    <w:link w:val="827"/>
     <w:uiPriority w:val="9"/>
     <w:pPr>
       <w:pBdr/>
@@ -31894,10 +31950,10 @@
       <w:szCs w:val="40"/>
     </w:rPr>
   </w:style>
-  <w:style w:type="character" w:styleId="151">
+  <w:style w:type="character" w:styleId="838">
     <w:name w:val="Heading 2 Char"/>
-    <w:basedOn w:val="148"/>
-    <w:link w:val="140"/>
+    <w:basedOn w:val="836"/>
+    <w:link w:val="828"/>
     <w:uiPriority w:val="9"/>
     <w:pPr>
       <w:pBdr/>
@@ -31911,10 +31967,10 @@
       <w:szCs w:val="32"/>
     </w:rPr>
   </w:style>
-  <w:style w:type="character" w:styleId="152">
+  <w:style w:type="character" w:styleId="839">
     <w:name w:val="Heading 3 Char"/>
-    <w:basedOn w:val="148"/>
-    <w:link w:val="141"/>
+    <w:basedOn w:val="836"/>
+    <w:link w:val="829"/>
     <w:uiPriority w:val="9"/>
     <w:pPr>
       <w:pBdr/>
@@ -31928,10 +31984,10 @@
       <w:szCs w:val="28"/>
     </w:rPr>
   </w:style>
-  <w:style w:type="character" w:styleId="153">
+  <w:style w:type="character" w:styleId="840">
     <w:name w:val="Heading 4 Char"/>
-    <w:basedOn w:val="148"/>
-    <w:link w:val="142"/>
+    <w:basedOn w:val="836"/>
+    <w:link w:val="830"/>
     <w:uiPriority w:val="9"/>
     <w:pPr>
       <w:pBdr/>
@@ -31945,10 +32001,10 @@
       <w:color w:val="0f4761" w:themeColor="accent1" w:themeShade="BF"/>
     </w:rPr>
   </w:style>
-  <w:style w:type="character" w:styleId="154">
+  <w:style w:type="character" w:styleId="841">
     <w:name w:val="Heading 5 Char"/>
-    <w:basedOn w:val="148"/>
-    <w:link w:val="143"/>
+    <w:basedOn w:val="836"/>
+    <w:link w:val="831"/>
     <w:uiPriority w:val="9"/>
     <w:pPr>
       <w:pBdr/>
@@ -31960,10 +32016,10 @@
       <w:color w:val="0f4761" w:themeColor="accent1" w:themeShade="BF"/>
     </w:rPr>
   </w:style>
-  <w:style w:type="character" w:styleId="155">
+  <w:style w:type="character" w:styleId="842">
     <w:name w:val="Heading 6 Char"/>
-    <w:basedOn w:val="148"/>
-    <w:link w:val="144"/>
+    <w:basedOn w:val="836"/>
+    <w:link w:val="832"/>
     <w:uiPriority w:val="9"/>
     <w:pPr>
       <w:pBdr/>
@@ -31977,10 +32033,10 @@
       <w:color w:val="595959" w:themeColor="text1" w:themeTint="A6"/>
     </w:rPr>
   </w:style>
-  <w:style w:type="character" w:styleId="156">
+  <w:style w:type="character" w:styleId="843">
     <w:name w:val="Heading 7 Char"/>
-    <w:basedOn w:val="148"/>
-    <w:link w:val="145"/>
+    <w:basedOn w:val="836"/>
+    <w:link w:val="833"/>
     <w:uiPriority w:val="9"/>
     <w:pPr>
       <w:pBdr/>
@@ -31992,10 +32048,10 @@
       <w:color w:val="595959" w:themeColor="text1" w:themeTint="A6"/>
     </w:rPr>
   </w:style>
-  <w:style w:type="character" w:styleId="157">
+  <w:style w:type="character" w:styleId="844">
     <w:name w:val="Heading 8 Char"/>
-    <w:basedOn w:val="148"/>
-    <w:link w:val="146"/>
+    <w:basedOn w:val="836"/>
+    <w:link w:val="834"/>
     <w:uiPriority w:val="9"/>
     <w:pPr>
       <w:pBdr/>
@@ -32009,10 +32065,10 @@
       <w:color w:val="272727" w:themeColor="text1" w:themeTint="D8"/>
     </w:rPr>
   </w:style>
-  <w:style w:type="character" w:styleId="158">
+  <w:style w:type="character" w:styleId="845">
     <w:name w:val="Heading 9 Char"/>
-    <w:basedOn w:val="148"/>
-    <w:link w:val="147"/>
+    <w:basedOn w:val="836"/>
+    <w:link w:val="835"/>
     <w:uiPriority w:val="9"/>
     <w:pPr>
       <w:pBdr/>
@@ -32026,11 +32082,11 @@
       <w:color w:val="272727" w:themeColor="text1" w:themeTint="D8"/>
     </w:rPr>
   </w:style>
-  <w:style w:type="paragraph" w:styleId="159">
+  <w:style w:type="paragraph" w:styleId="846">
     <w:name w:val="Title"/>
-    <w:basedOn w:val="664"/>
-    <w:next w:val="664"/>
-    <w:link w:val="160"/>
+    <w:basedOn w:val="886"/>
+    <w:next w:val="886"/>
+    <w:link w:val="847"/>
     <w:uiPriority w:val="10"/>
     <w:qFormat/>
     <w:pPr>
@@ -32046,10 +32102,10 @@
       <w:szCs w:val="56"/>
     </w:rPr>
   </w:style>
-  <w:style w:type="character" w:styleId="160">
+  <w:style w:type="character" w:styleId="847">
     <w:name w:val="Title Char"/>
-    <w:basedOn w:val="148"/>
-    <w:link w:val="159"/>
+    <w:basedOn w:val="836"/>
+    <w:link w:val="846"/>
     <w:uiPriority w:val="10"/>
     <w:pPr>
       <w:pBdr/>
@@ -32063,11 +32119,11 @@
       <w:szCs w:val="56"/>
     </w:rPr>
   </w:style>
-  <w:style w:type="paragraph" w:styleId="161">
+  <w:style w:type="paragraph" w:styleId="848">
     <w:name w:val="Subtitle"/>
-    <w:basedOn w:val="664"/>
-    <w:next w:val="664"/>
-    <w:link w:val="162"/>
+    <w:basedOn w:val="886"/>
+    <w:next w:val="886"/>
+    <w:link w:val="849"/>
     <w:uiPriority w:val="11"/>
     <w:qFormat/>
     <w:pPr>
@@ -32085,10 +32141,10 @@
       <w:szCs w:val="28"/>
     </w:rPr>
   </w:style>
-  <w:style w:type="character" w:styleId="162">
+  <w:style w:type="character" w:styleId="849">
     <w:name w:val="Subtitle Char"/>
-    <w:basedOn w:val="148"/>
-    <w:link w:val="161"/>
+    <w:basedOn w:val="836"/>
+    <w:link w:val="848"/>
     <w:uiPriority w:val="11"/>
     <w:pPr>
       <w:pBdr/>
@@ -32102,11 +32158,11 @@
       <w:szCs w:val="28"/>
     </w:rPr>
   </w:style>
-  <w:style w:type="paragraph" w:styleId="163">
+  <w:style w:type="paragraph" w:styleId="850">
     <w:name w:val="Quote"/>
-    <w:basedOn w:val="664"/>
-    <w:next w:val="664"/>
-    <w:link w:val="164"/>
+    <w:basedOn w:val="886"/>
+    <w:next w:val="886"/>
+    <w:link w:val="851"/>
     <w:uiPriority w:val="29"/>
     <w:qFormat/>
     <w:pPr>
@@ -32121,10 +32177,10 @@
       <w:color w:val="404040" w:themeColor="text1" w:themeTint="BF"/>
     </w:rPr>
   </w:style>
-  <w:style w:type="character" w:styleId="164">
+  <w:style w:type="character" w:styleId="851">
     <w:name w:val="Quote Char"/>
-    <w:basedOn w:val="148"/>
-    <w:link w:val="163"/>
+    <w:basedOn w:val="836"/>
+    <w:link w:val="850"/>
     <w:uiPriority w:val="29"/>
     <w:pPr>
       <w:pBdr/>
@@ -32137,9 +32193,9 @@
       <w:color w:val="404040" w:themeColor="text1" w:themeTint="BF"/>
     </w:rPr>
   </w:style>
-  <w:style w:type="character" w:styleId="166">
+  <w:style w:type="character" w:styleId="852">
     <w:name w:val="Intense Emphasis"/>
-    <w:basedOn w:val="148"/>
+    <w:basedOn w:val="836"/>
     <w:uiPriority w:val="21"/>
     <w:qFormat/>
     <w:pPr>
@@ -32153,11 +32209,11 @@
       <w:color w:val="0f4761" w:themeColor="accent1" w:themeShade="BF"/>
     </w:rPr>
   </w:style>
-  <w:style w:type="paragraph" w:styleId="167">
+  <w:style w:type="paragraph" w:styleId="853">
     <w:name w:val="Intense Quote"/>
-    <w:basedOn w:val="664"/>
-    <w:next w:val="664"/>
-    <w:link w:val="168"/>
+    <w:basedOn w:val="886"/>
+    <w:next w:val="886"/>
+    <w:link w:val="854"/>
     <w:uiPriority w:val="30"/>
     <w:qFormat/>
     <w:pPr>
@@ -32175,10 +32231,10 @@
       <w:color w:val="0f4761" w:themeColor="accent1" w:themeShade="BF"/>
     </w:rPr>
   </w:style>
-  <w:style w:type="character" w:styleId="168">
+  <w:style w:type="character" w:styleId="854">
     <w:name w:val="Intense Quote Char"/>
-    <w:basedOn w:val="148"/>
-    <w:link w:val="167"/>
+    <w:basedOn w:val="836"/>
+    <w:link w:val="853"/>
     <w:uiPriority w:val="30"/>
     <w:pPr>
       <w:pBdr/>
@@ -32191,9 +32247,9 @@
       <w:color w:val="0f4761" w:themeColor="accent1" w:themeShade="BF"/>
     </w:rPr>
   </w:style>
-  <w:style w:type="character" w:styleId="169">
+  <w:style w:type="character" w:styleId="855">
     <w:name w:val="Intense Reference"/>
-    <w:basedOn w:val="148"/>
+    <w:basedOn w:val="836"/>
     <w:uiPriority w:val="32"/>
     <w:qFormat/>
     <w:pPr>
@@ -32209,9 +32265,9 @@
       <w:spacing w:val="5"/>
     </w:rPr>
   </w:style>
-  <w:style w:type="character" w:styleId="171">
+  <w:style w:type="character" w:styleId="856">
     <w:name w:val="Subtle Emphasis"/>
-    <w:basedOn w:val="148"/>
+    <w:basedOn w:val="836"/>
     <w:uiPriority w:val="19"/>
     <w:qFormat/>
     <w:pPr>
@@ -32225,9 +32281,9 @@
       <w:color w:val="404040" w:themeColor="text1" w:themeTint="BF"/>
     </w:rPr>
   </w:style>
-  <w:style w:type="character" w:styleId="172">
+  <w:style w:type="character" w:styleId="857">
     <w:name w:val="Emphasis"/>
-    <w:basedOn w:val="148"/>
+    <w:basedOn w:val="836"/>
     <w:uiPriority w:val="20"/>
     <w:qFormat/>
     <w:pPr>
@@ -32240,9 +32296,9 @@
       <w:iCs/>
     </w:rPr>
   </w:style>
-  <w:style w:type="character" w:styleId="173">
+  <w:style w:type="character" w:styleId="858">
     <w:name w:val="Strong"/>
-    <w:basedOn w:val="148"/>
+    <w:basedOn w:val="836"/>
     <w:uiPriority w:val="22"/>
     <w:qFormat/>
     <w:pPr>
@@ -32255,9 +32311,9 @@
       <w:bCs/>
     </w:rPr>
   </w:style>
-  <w:style w:type="character" w:styleId="174">
+  <w:style w:type="character" w:styleId="859">
     <w:name w:val="Subtle Reference"/>
-    <w:basedOn w:val="148"/>
+    <w:basedOn w:val="836"/>
     <w:uiPriority w:val="31"/>
     <w:qFormat/>
     <w:pPr>
@@ -32270,9 +32326,9 @@
       <w:color w:val="5a5a5a" w:themeColor="text1" w:themeTint="A5"/>
     </w:rPr>
   </w:style>
-  <w:style w:type="character" w:styleId="175">
+  <w:style w:type="character" w:styleId="860">
     <w:name w:val="Book Title"/>
-    <w:basedOn w:val="148"/>
+    <w:basedOn w:val="836"/>
     <w:uiPriority w:val="33"/>
     <w:qFormat/>
     <w:pPr>
@@ -32288,10 +32344,10 @@
       <w:spacing w:val="5"/>
     </w:rPr>
   </w:style>
-  <w:style w:type="paragraph" w:styleId="176">
+  <w:style w:type="paragraph" w:styleId="861">
     <w:name w:val="Header"/>
-    <w:basedOn w:val="664"/>
-    <w:link w:val="177"/>
+    <w:basedOn w:val="886"/>
+    <w:link w:val="862"/>
     <w:uiPriority w:val="99"/>
     <w:unhideWhenUsed/>
     <w:pPr>
@@ -32304,10 +32360,10 @@
       <w:ind/>
     </w:pPr>
   </w:style>
-  <w:style w:type="character" w:styleId="177">
+  <w:style w:type="character" w:styleId="862">
     <w:name w:val="Header Char"/>
-    <w:basedOn w:val="148"/>
-    <w:link w:val="176"/>
+    <w:basedOn w:val="836"/>
+    <w:link w:val="861"/>
     <w:uiPriority w:val="99"/>
     <w:pPr>
       <w:pBdr/>
@@ -32315,10 +32371,10 @@
       <w:ind/>
     </w:pPr>
   </w:style>
-  <w:style w:type="paragraph" w:styleId="178">
+  <w:style w:type="paragraph" w:styleId="863">
     <w:name w:val="Footer"/>
-    <w:basedOn w:val="664"/>
-    <w:link w:val="179"/>
+    <w:basedOn w:val="886"/>
+    <w:link w:val="864"/>
     <w:uiPriority w:val="99"/>
     <w:unhideWhenUsed/>
     <w:pPr>
@@ -32331,10 +32387,10 @@
       <w:ind/>
     </w:pPr>
   </w:style>
-  <w:style w:type="character" w:styleId="179">
+  <w:style w:type="character" w:styleId="864">
     <w:name w:val="Footer Char"/>
-    <w:basedOn w:val="148"/>
-    <w:link w:val="178"/>
+    <w:basedOn w:val="836"/>
+    <w:link w:val="863"/>
     <w:uiPriority w:val="99"/>
     <w:pPr>
       <w:pBdr/>
@@ -32342,10 +32398,10 @@
       <w:ind/>
     </w:pPr>
   </w:style>
-  <w:style w:type="paragraph" w:styleId="180">
+  <w:style w:type="paragraph" w:styleId="865">
     <w:name w:val="Caption"/>
-    <w:basedOn w:val="664"/>
-    <w:next w:val="664"/>
+    <w:basedOn w:val="886"/>
+    <w:next w:val="886"/>
     <w:uiPriority w:val="35"/>
     <w:unhideWhenUsed/>
     <w:qFormat/>
@@ -32362,10 +32418,10 @@
       <w:szCs w:val="18"/>
     </w:rPr>
   </w:style>
-  <w:style w:type="paragraph" w:styleId="181">
+  <w:style w:type="paragraph" w:styleId="866">
     <w:name w:val="footnote text"/>
-    <w:basedOn w:val="664"/>
-    <w:link w:val="182"/>
+    <w:basedOn w:val="886"/>
+    <w:link w:val="867"/>
     <w:uiPriority w:val="99"/>
     <w:semiHidden/>
     <w:unhideWhenUsed/>
@@ -32379,10 +32435,10 @@
       <w:szCs w:val="20"/>
     </w:rPr>
   </w:style>
-  <w:style w:type="character" w:styleId="182">
+  <w:style w:type="character" w:styleId="867">
     <w:name w:val="Footnote Text Char"/>
-    <w:basedOn w:val="148"/>
-    <w:link w:val="181"/>
+    <w:basedOn w:val="836"/>
+    <w:link w:val="866"/>
     <w:uiPriority w:val="99"/>
     <w:semiHidden/>
     <w:pPr>
@@ -32395,9 +32451,9 @@
       <w:szCs w:val="20"/>
     </w:rPr>
   </w:style>
-  <w:style w:type="character" w:styleId="183">
+  <w:style w:type="character" w:styleId="868">
     <w:name w:val="footnote reference"/>
-    <w:basedOn w:val="148"/>
+    <w:basedOn w:val="836"/>
     <w:uiPriority w:val="99"/>
     <w:semiHidden/>
     <w:unhideWhenUsed/>
@@ -32410,10 +32466,10 @@
       <w:vertAlign w:val="superscript"/>
     </w:rPr>
   </w:style>
-  <w:style w:type="paragraph" w:styleId="184">
+  <w:style w:type="paragraph" w:styleId="869">
     <w:name w:val="endnote text"/>
-    <w:basedOn w:val="664"/>
-    <w:link w:val="185"/>
+    <w:basedOn w:val="886"/>
+    <w:link w:val="870"/>
     <w:uiPriority w:val="99"/>
     <w:semiHidden/>
     <w:unhideWhenUsed/>
@@ -32427,10 +32483,10 @@
       <w:szCs w:val="20"/>
     </w:rPr>
   </w:style>
-  <w:style w:type="character" w:styleId="185">
+  <w:style w:type="character" w:styleId="870">
     <w:name w:val="Endnote Text Char"/>
-    <w:basedOn w:val="148"/>
-    <w:link w:val="184"/>
+    <w:basedOn w:val="836"/>
+    <w:link w:val="869"/>
     <w:uiPriority w:val="99"/>
     <w:semiHidden/>
     <w:pPr>
@@ -32443,9 +32499,9 @@
       <w:szCs w:val="20"/>
     </w:rPr>
   </w:style>
-  <w:style w:type="character" w:styleId="186">
+  <w:style w:type="character" w:styleId="871">
     <w:name w:val="endnote reference"/>
-    <w:basedOn w:val="148"/>
+    <w:basedOn w:val="836"/>
     <w:uiPriority w:val="99"/>
     <w:semiHidden/>
     <w:unhideWhenUsed/>
@@ -32458,9 +32514,9 @@
       <w:vertAlign w:val="superscript"/>
     </w:rPr>
   </w:style>
-  <w:style w:type="character" w:styleId="187">
+  <w:style w:type="character" w:styleId="872">
     <w:name w:val="Hyperlink"/>
-    <w:basedOn w:val="148"/>
+    <w:basedOn w:val="836"/>
     <w:uiPriority w:val="99"/>
     <w:unhideWhenUsed/>
     <w:pPr>
@@ -32473,9 +32529,9 @@
       <w:u w:val="single"/>
     </w:rPr>
   </w:style>
-  <w:style w:type="character" w:styleId="188">
+  <w:style w:type="character" w:styleId="873">
     <w:name w:val="FollowedHyperlink"/>
-    <w:basedOn w:val="148"/>
+    <w:basedOn w:val="836"/>
     <w:uiPriority w:val="99"/>
     <w:semiHidden/>
     <w:unhideWhenUsed/>
@@ -32489,10 +32545,10 @@
       <w:u w:val="single"/>
     </w:rPr>
   </w:style>
-  <w:style w:type="paragraph" w:styleId="189">
+  <w:style w:type="paragraph" w:styleId="874">
     <w:name w:val="toc 1"/>
-    <w:basedOn w:val="664"/>
-    <w:next w:val="664"/>
+    <w:basedOn w:val="886"/>
+    <w:next w:val="886"/>
     <w:uiPriority w:val="39"/>
     <w:unhideWhenUsed/>
     <w:pPr>
@@ -32501,10 +32557,10 @@
       <w:ind/>
     </w:pPr>
   </w:style>
-  <w:style w:type="paragraph" w:styleId="190">
+  <w:style w:type="paragraph" w:styleId="875">
     <w:name w:val="toc 2"/>
-    <w:basedOn w:val="664"/>
-    <w:next w:val="664"/>
+    <w:basedOn w:val="886"/>
+    <w:next w:val="886"/>
     <w:uiPriority w:val="39"/>
     <w:unhideWhenUsed/>
     <w:pPr>
@@ -32513,10 +32569,10 @@
       <w:ind w:left="220"/>
     </w:pPr>
   </w:style>
-  <w:style w:type="paragraph" w:styleId="191">
+  <w:style w:type="paragraph" w:styleId="876">
     <w:name w:val="toc 3"/>
-    <w:basedOn w:val="664"/>
-    <w:next w:val="664"/>
+    <w:basedOn w:val="886"/>
+    <w:next w:val="886"/>
     <w:uiPriority w:val="39"/>
     <w:unhideWhenUsed/>
     <w:pPr>
@@ -32525,10 +32581,10 @@
       <w:ind w:left="440"/>
     </w:pPr>
   </w:style>
-  <w:style w:type="paragraph" w:styleId="192">
+  <w:style w:type="paragraph" w:styleId="877">
     <w:name w:val="toc 4"/>
-    <w:basedOn w:val="664"/>
-    <w:next w:val="664"/>
+    <w:basedOn w:val="886"/>
+    <w:next w:val="886"/>
     <w:uiPriority w:val="39"/>
     <w:unhideWhenUsed/>
     <w:pPr>
@@ -32537,10 +32593,10 @@
       <w:ind w:left="660"/>
     </w:pPr>
   </w:style>
-  <w:style w:type="paragraph" w:styleId="193">
+  <w:style w:type="paragraph" w:styleId="878">
     <w:name w:val="toc 5"/>
-    <w:basedOn w:val="664"/>
-    <w:next w:val="664"/>
+    <w:basedOn w:val="886"/>
+    <w:next w:val="886"/>
     <w:uiPriority w:val="39"/>
     <w:unhideWhenUsed/>
     <w:pPr>
@@ -32549,10 +32605,10 @@
       <w:ind w:left="880"/>
     </w:pPr>
   </w:style>
-  <w:style w:type="paragraph" w:styleId="194">
+  <w:style w:type="paragraph" w:styleId="879">
     <w:name w:val="toc 6"/>
-    <w:basedOn w:val="664"/>
-    <w:next w:val="664"/>
+    <w:basedOn w:val="886"/>
+    <w:next w:val="886"/>
     <w:uiPriority w:val="39"/>
     <w:unhideWhenUsed/>
     <w:pPr>
@@ -32561,10 +32617,10 @@
       <w:ind w:left="1100"/>
     </w:pPr>
   </w:style>
-  <w:style w:type="paragraph" w:styleId="195">
+  <w:style w:type="paragraph" w:styleId="880">
     <w:name w:val="toc 7"/>
-    <w:basedOn w:val="664"/>
-    <w:next w:val="664"/>
+    <w:basedOn w:val="886"/>
+    <w:next w:val="886"/>
     <w:uiPriority w:val="39"/>
     <w:unhideWhenUsed/>
     <w:pPr>
@@ -32573,10 +32629,10 @@
       <w:ind w:left="1320"/>
     </w:pPr>
   </w:style>
-  <w:style w:type="paragraph" w:styleId="196">
+  <w:style w:type="paragraph" w:styleId="881">
     <w:name w:val="toc 8"/>
-    <w:basedOn w:val="664"/>
-    <w:next w:val="664"/>
+    <w:basedOn w:val="886"/>
+    <w:next w:val="886"/>
     <w:uiPriority w:val="39"/>
     <w:unhideWhenUsed/>
     <w:pPr>
@@ -32585,10 +32641,10 @@
       <w:ind w:left="1540"/>
     </w:pPr>
   </w:style>
-  <w:style w:type="paragraph" w:styleId="197">
+  <w:style w:type="paragraph" w:styleId="882">
     <w:name w:val="toc 9"/>
-    <w:basedOn w:val="664"/>
-    <w:next w:val="664"/>
+    <w:basedOn w:val="886"/>
+    <w:next w:val="886"/>
     <w:uiPriority w:val="39"/>
     <w:unhideWhenUsed/>
     <w:pPr>
@@ -32597,9 +32653,9 @@
       <w:ind w:left="1760"/>
     </w:pPr>
   </w:style>
-  <w:style w:type="character" w:styleId="198">
+  <w:style w:type="character" w:styleId="883">
     <w:name w:val="Placeholder Text"/>
-    <w:basedOn w:val="148"/>
+    <w:basedOn w:val="836"/>
     <w:uiPriority w:val="99"/>
     <w:semiHidden/>
     <w:pPr>
@@ -32611,7 +32667,7 @@
       <w:color w:val="666666"/>
     </w:rPr>
   </w:style>
-  <w:style w:type="paragraph" w:styleId="208">
+  <w:style w:type="paragraph" w:styleId="884">
     <w:name w:val="TOC Heading"/>
     <w:uiPriority w:val="39"/>
     <w:unhideWhenUsed/>
@@ -32621,10 +32677,10 @@
       <w:ind/>
     </w:pPr>
   </w:style>
-  <w:style w:type="paragraph" w:styleId="209">
+  <w:style w:type="paragraph" w:styleId="885">
     <w:name w:val="table of figures"/>
-    <w:basedOn w:val="664"/>
-    <w:next w:val="664"/>
+    <w:basedOn w:val="886"/>
+    <w:next w:val="886"/>
     <w:uiPriority w:val="99"/>
     <w:unhideWhenUsed/>
     <w:pPr>
@@ -32633,7 +32689,7 @@
       <w:ind/>
     </w:pPr>
   </w:style>
-  <w:style w:type="paragraph" w:styleId="664" w:default="1">
+  <w:style w:type="paragraph" w:styleId="886" w:default="1">
     <w:name w:val="Normal"/>
     <w:qFormat/>
     <w:pPr>
@@ -32642,7 +32698,7 @@
       <w:ind/>
     </w:pPr>
   </w:style>
-  <w:style w:type="table" w:styleId="665" w:default="1">
+  <w:style w:type="table" w:styleId="887" w:default="1">
     <w:name w:val="Normal Table"/>
     <w:uiPriority w:val="99"/>
     <w:semiHidden/>
@@ -32835,7 +32891,7 @@
       </w:tcPr>
     </w:tblStylePr>
   </w:style>
-  <w:style w:type="numbering" w:styleId="666" w:default="1">
+  <w:style w:type="numbering" w:styleId="888" w:default="1">
     <w:name w:val="No List"/>
     <w:uiPriority w:val="99"/>
     <w:semiHidden/>
@@ -32846,9 +32902,9 @@
       <w:ind/>
     </w:pPr>
   </w:style>
-  <w:style w:type="paragraph" w:styleId="667">
+  <w:style w:type="paragraph" w:styleId="889">
     <w:name w:val="No Spacing"/>
-    <w:basedOn w:val="664"/>
+    <w:basedOn w:val="886"/>
     <w:uiPriority w:val="1"/>
     <w:qFormat/>
     <w:pPr>
@@ -32857,9 +32913,9 @@
       <w:ind/>
     </w:pPr>
   </w:style>
-  <w:style w:type="paragraph" w:styleId="668">
+  <w:style w:type="paragraph" w:styleId="890">
     <w:name w:val="List Paragraph"/>
-    <w:basedOn w:val="664"/>
+    <w:basedOn w:val="886"/>
     <w:uiPriority w:val="34"/>
     <w:qFormat/>
     <w:pPr>

</xml_diff>